<commit_message>
Tailor 75k and 85k packages specifically for 6-person boutique CPA office
</commit_message>
<xml_diff>
--- a/JTYeo_CPA_Accounting_Office_Leave_Proposal_v2.docx
+++ b/JTYeo_CPA_Accounting_Office_Leave_Proposal_v2.docx
@@ -186,6 +186,91 @@
     </w:tbl>
     <w:p>
       <w:pPr>
+        <w:spacing w:after="240" w:line="276" w:lineRule="auto"/>
+      </w:pPr>
+      <w:r>
+        <w:rPr>
+          <w:b/>
+          <w:color w:val="0F2744"/>
+          <w:sz w:val="19"/>
+        </w:rPr>
+        <w:t xml:space="preserve">Client Practice: </w:t>
+      </w:r>
+      <w:r>
+        <w:rPr>
+          <w:color w:val="1E293B"/>
+          <w:sz w:val="19"/>
+        </w:rPr>
+        <w:t>JTYeo CPA Accounting Office</w:t>
+        <w:br/>
+      </w:r>
+      <w:r>
+        <w:rPr>
+          <w:b/>
+          <w:color w:val="0F2744"/>
+          <w:sz w:val="19"/>
+        </w:rPr>
+        <w:t xml:space="preserve">Managing Partner: </w:t>
+      </w:r>
+      <w:r>
+        <w:rPr>
+          <w:color w:val="1E293B"/>
+          <w:sz w:val="19"/>
+        </w:rPr>
+        <w:t>Atty. Jonathan Yeo, CPA</w:t>
+        <w:br/>
+      </w:r>
+      <w:r>
+        <w:rPr>
+          <w:b/>
+          <w:color w:val="0F2744"/>
+          <w:sz w:val="19"/>
+        </w:rPr>
+        <w:t xml:space="preserve">Practice Profile: </w:t>
+      </w:r>
+      <w:r>
+        <w:rPr>
+          <w:color w:val="1E293B"/>
+          <w:sz w:val="19"/>
+        </w:rPr>
+        <w:t>Boutique CPA &amp; Tax Practice (6 Personnel: 1 Managing Partner + 5 Associates)</w:t>
+        <w:br/>
+      </w:r>
+      <w:r>
+        <w:rPr>
+          <w:b/>
+          <w:color w:val="0F2744"/>
+          <w:sz w:val="19"/>
+        </w:rPr>
+        <w:t xml:space="preserve">Date: </w:t>
+      </w:r>
+      <w:r>
+        <w:rPr>
+          <w:color w:val="1E293B"/>
+          <w:sz w:val="19"/>
+        </w:rPr>
+        <w:t>August 2026</w:t>
+        <w:br/>
+      </w:r>
+      <w:r>
+        <w:rPr>
+          <w:b/>
+          <w:color w:val="0F2744"/>
+          <w:sz w:val="19"/>
+        </w:rPr>
+        <w:t xml:space="preserve">Document Ref: </w:t>
+      </w:r>
+      <w:r>
+        <w:rPr>
+          <w:color w:val="1E293B"/>
+          <w:sz w:val="19"/>
+        </w:rPr>
+        <w:t>PROP-2026-JTYEO-02 (2-Tier Implementation Options)</w:t>
+        <w:br/>
+      </w:r>
+    </w:p>
+    <w:p>
+      <w:pPr>
         <w:spacing w:after="200"/>
       </w:pPr>
     </w:p>
@@ -196,7 +281,7 @@
           <w:color w:val="0F2744"/>
           <w:sz w:val="28"/>
         </w:rPr>
-        <w:t>1. Executive Summary &amp; Value Proposition</w:t>
+        <w:t>1. Executive Summary &amp; Practice Context</w:t>
       </w:r>
     </w:p>
     <w:p>
@@ -208,10 +293,10 @@
           <w:color w:val="1E293B"/>
           <w:sz w:val="20"/>
         </w:rPr>
-        <w:t>For an established accounting and auditing practice, workforce scheduling, statutory leave compliance, and billable hour preservation during peak tax and audit deadlines are paramount. Manual tracking via paper forms or spreadsheets leads to unverified absences, lost billable hours, engagement coverage blindspots, and unexpected year-end cash liabilities under standard Service Incentive Leave (SIL) rules.</w:t>
+        <w:t>In a boutique accounting and tax practice of 6 professionals (1 Managing Partner and 5 Associates), workforce coordination is vital. If even one or two staff members are away concurrently during peak audit cut-offs or tax filing deadlines, up to 33% to 50% of the firm's operational capacity is impacted. Manual tracking via paper forms or spreadsheets leads to unverified absences, engagement coverage blindspots, and unexpected year-end cash payout obligations.</w:t>
         <w:br/>
         <w:br/>
-        <w:t>This proposal presents two clear, tailored implementation packages for JTYeo CPA Accounting Office:</w:t>
+        <w:t>This proposal presents two tailored implementation packages custom-engineered for JTYeo CPA Accounting Office:</w:t>
       </w:r>
     </w:p>
     <w:p>
@@ -223,10 +308,10 @@
           <w:b/>
           <w:color w:val="0F2744"/>
         </w:rPr>
-        <w:t xml:space="preserve">Tier 1: Professional CPA Practice Edition (₱75,000) — </w:t>
+        <w:t xml:space="preserve">Tier 1: Boutique Practice Edition (₱75,000) — </w:t>
       </w:r>
       <w:r>
-        <w:t>Complete 12-category leave management, staff self-service balances, partner approval queue &amp; on-behalf filing, and clean leave details modal.</w:t>
+        <w:t>Dedicated 6-user digital leave management portal, 5 core categories, employee self-service balance ledgers, Managing Partner approval queue &amp; proxy filing, and server deployment.</w:t>
       </w:r>
     </w:p>
     <w:p>
@@ -238,10 +323,10 @@
           <w:b/>
           <w:color w:val="0284C7"/>
         </w:rPr>
-        <w:t xml:space="preserve">Tier 2: Enterprise Practice Cloud Suite (₱85,000) ⭐ Recommended Flagship — </w:t>
+        <w:t xml:space="preserve">Tier 2: Boutique Practice Cloud Suite (₱85,000) ⭐ Recommended Flagship — </w:t>
       </w:r>
       <w:r>
-        <w:t>Everything in Tier 1 PLUS Automated Holiday &amp; Working Days Exclusion Engine, Peak Tax Season Blackout Advisory, Interactive Team Calendar, Medical Certificate Proof Viewer, automated one-click payroll CSV export (JuanTax/Sprout/QuickBooks), Year-End Unused Leave Cash Conversion Ledger, immutable enterprise audit trails, automated email alerts, and 3 months priority SLA warranty.</w:t>
+        <w:t>Everything in Tier 1 PLUS 1-click semi-monthly payroll CSV export (JuanTax/Sprout/QuickBooks), Year-End Unused Leave Cash Conversion Ledger &amp; Reserve Calculator, Interactive 6-Person Team Coverage Calendar, Medical Proof Viewer, immutable audit trails with IP tracking, automated email alerts, and 3 months priority SLA warranty.</w:t>
       </w:r>
     </w:p>
     <w:p>
@@ -273,39 +358,13 @@
       <w:tr>
         <w:tc>
           <w:tcPr>
-            <w:tcW w:type="dxa" w:w="4896"/>
+            <w:tcW w:type="dxa" w:w="2880"/>
             <w:vAlign w:val="center"/>
             <w:tcMar>
-              <w:top w:w="90" w:type="dxa"/>
-              <w:bottom w:w="90" w:type="dxa"/>
-              <w:left w:w="110" w:type="dxa"/>
-              <w:right w:w="110" w:type="dxa"/>
-            </w:tcMar>
-            <w:shd w:fill="0F2744"/>
-          </w:tcPr>
-          <w:p>
-            <w:pPr>
-              <w:spacing w:after="0"/>
-            </w:pPr>
-            <w:r>
-              <w:rPr>
-                <w:b/>
-                <w:color w:val="FFFFFF"/>
-                <w:sz w:val="19"/>
-              </w:rPr>
-              <w:t>Feature &amp; Capability</w:t>
-            </w:r>
-          </w:p>
-        </w:tc>
-        <w:tc>
-          <w:tcPr>
-            <w:tcW w:type="dxa" w:w="2592"/>
-            <w:vAlign w:val="center"/>
-            <w:tcMar>
-              <w:top w:w="90" w:type="dxa"/>
-              <w:bottom w:w="90" w:type="dxa"/>
-              <w:left w:w="110" w:type="dxa"/>
-              <w:right w:w="110" w:type="dxa"/>
+              <w:top w:w="80" w:type="dxa"/>
+              <w:bottom w:w="80" w:type="dxa"/>
+              <w:left w:w="100" w:type="dxa"/>
+              <w:right w:w="100" w:type="dxa"/>
             </w:tcMar>
             <w:shd w:fill="0F2744"/>
           </w:tcPr>
@@ -320,23 +379,19 @@
                 <w:color w:val="FFFFFF"/>
                 <w:sz w:val="19"/>
               </w:rPr>
-              <w:t>Tier 1: Pro Edition</w:t>
-              <w:br/>
-              <w:t>(₱75,000)</w:t>
-              <w:br/>
-              <w:t>[The Live System]</w:t>
+              <w:t>System Module &amp; Capability</w:t>
             </w:r>
           </w:p>
         </w:tc>
         <w:tc>
           <w:tcPr>
-            <w:tcW w:type="dxa" w:w="2880"/>
+            <w:tcW w:type="dxa" w:w="3600"/>
             <w:vAlign w:val="center"/>
             <w:tcMar>
-              <w:top w:w="90" w:type="dxa"/>
-              <w:bottom w:w="90" w:type="dxa"/>
-              <w:left w:w="110" w:type="dxa"/>
-              <w:right w:w="110" w:type="dxa"/>
+              <w:top w:w="80" w:type="dxa"/>
+              <w:bottom w:w="80" w:type="dxa"/>
+              <w:left w:w="100" w:type="dxa"/>
+              <w:right w:w="100" w:type="dxa"/>
             </w:tcMar>
             <w:shd w:fill="0F2744"/>
           </w:tcPr>
@@ -351,11 +406,38 @@
                 <w:color w:val="FFFFFF"/>
                 <w:sz w:val="19"/>
               </w:rPr>
-              <w:t>Tier 2: Enterprise Suite</w:t>
+              <w:t>Tier 1: Boutique Edition</w:t>
+              <w:br/>
+              <w:t>(₱75,000)</w:t>
+            </w:r>
+          </w:p>
+        </w:tc>
+        <w:tc>
+          <w:tcPr>
+            <w:tcW w:type="dxa" w:w="3888"/>
+            <w:vAlign w:val="center"/>
+            <w:tcMar>
+              <w:top w:w="80" w:type="dxa"/>
+              <w:bottom w:w="80" w:type="dxa"/>
+              <w:left w:w="100" w:type="dxa"/>
+              <w:right w:w="100" w:type="dxa"/>
+            </w:tcMar>
+            <w:shd w:fill="0F2744"/>
+          </w:tcPr>
+          <w:p>
+            <w:pPr>
+              <w:spacing w:after="0"/>
+              <w:jc w:val="center"/>
+            </w:pPr>
+            <w:r>
+              <w:rPr>
+                <w:b/>
+                <w:color w:val="FFFFFF"/>
+                <w:sz w:val="19"/>
+              </w:rPr>
+              <w:t>Tier 2: Boutique Suite</w:t>
               <w:br/>
               <w:t>(₱85,000) 🏆</w:t>
-              <w:br/>
-              <w:t>[Target Flagship]</w:t>
             </w:r>
           </w:p>
         </w:tc>
@@ -363,13 +445,39 @@
       <w:tr>
         <w:tc>
           <w:tcPr>
-            <w:tcW w:type="dxa" w:w="4896"/>
+            <w:tcW w:type="dxa" w:w="2880"/>
             <w:vAlign w:val="center"/>
             <w:tcMar>
-              <w:top w:w="90" w:type="dxa"/>
-              <w:bottom w:w="90" w:type="dxa"/>
-              <w:left w:w="110" w:type="dxa"/>
-              <w:right w:w="110" w:type="dxa"/>
+              <w:top w:w="80" w:type="dxa"/>
+              <w:bottom w:w="80" w:type="dxa"/>
+              <w:left w:w="100" w:type="dxa"/>
+              <w:right w:w="100" w:type="dxa"/>
+            </w:tcMar>
+            <w:shd w:fill="FFFFFF"/>
+          </w:tcPr>
+          <w:p>
+            <w:pPr>
+              <w:spacing w:after="0"/>
+            </w:pPr>
+            <w:r>
+              <w:rPr>
+                <w:b/>
+                <w:color w:val="0F2744"/>
+                <w:sz w:val="17"/>
+              </w:rPr>
+              <w:t>Target Practice Size</w:t>
+            </w:r>
+          </w:p>
+        </w:tc>
+        <w:tc>
+          <w:tcPr>
+            <w:tcW w:type="dxa" w:w="3600"/>
+            <w:vAlign w:val="center"/>
+            <w:tcMar>
+              <w:top w:w="80" w:type="dxa"/>
+              <w:bottom w:w="80" w:type="dxa"/>
+              <w:left w:w="100" w:type="dxa"/>
+              <w:right w:w="100" w:type="dxa"/>
             </w:tcMar>
             <w:shd w:fill="FFFFFF"/>
           </w:tcPr>
@@ -382,26 +490,52 @@
                 <w:color w:val="1E293B"/>
                 <w:sz w:val="17"/>
               </w:rPr>
-              <w:t>12 Statutory &amp; CPA Office Categories (SIL, VL, SL, CPD Study, Solo Parent, etc.)</w:t>
+              <w:t>Tailored for 6 Practice Personnel</w:t>
             </w:r>
           </w:p>
         </w:tc>
         <w:tc>
           <w:tcPr>
-            <w:tcW w:type="dxa" w:w="2592"/>
+            <w:tcW w:type="dxa" w:w="3888"/>
             <w:vAlign w:val="center"/>
             <w:tcMar>
-              <w:top w:w="90" w:type="dxa"/>
-              <w:bottom w:w="90" w:type="dxa"/>
-              <w:left w:w="110" w:type="dxa"/>
-              <w:right w:w="110" w:type="dxa"/>
+              <w:top w:w="80" w:type="dxa"/>
+              <w:bottom w:w="80" w:type="dxa"/>
+              <w:left w:w="100" w:type="dxa"/>
+              <w:right w:w="100" w:type="dxa"/>
             </w:tcMar>
-            <w:shd w:fill="FFFFFF"/>
+            <w:shd w:fill="F0FDF4"/>
           </w:tcPr>
           <w:p>
             <w:pPr>
               <w:spacing w:after="0"/>
-              <w:jc w:val="center"/>
+            </w:pPr>
+            <w:r>
+              <w:rPr>
+                <w:color w:val="1E293B"/>
+                <w:sz w:val="17"/>
+              </w:rPr>
+              <w:t>Tailored for 6 Practice Personnel + Expandable</w:t>
+            </w:r>
+          </w:p>
+        </w:tc>
+      </w:tr>
+      <w:tr>
+        <w:tc>
+          <w:tcPr>
+            <w:tcW w:type="dxa" w:w="2880"/>
+            <w:vAlign w:val="center"/>
+            <w:tcMar>
+              <w:top w:w="80" w:type="dxa"/>
+              <w:bottom w:w="80" w:type="dxa"/>
+              <w:left w:w="100" w:type="dxa"/>
+              <w:right w:w="100" w:type="dxa"/>
+            </w:tcMar>
+            <w:shd w:fill="F8FAFC"/>
+          </w:tcPr>
+          <w:p>
+            <w:pPr>
+              <w:spacing w:after="0"/>
             </w:pPr>
             <w:r>
               <w:rPr>
@@ -409,48 +543,19 @@
                 <w:color w:val="0F2744"/>
                 <w:sz w:val="17"/>
               </w:rPr>
-              <w:t>Included</w:t>
+              <w:t>Leave Policy Coverage</w:t>
             </w:r>
           </w:p>
         </w:tc>
         <w:tc>
           <w:tcPr>
-            <w:tcW w:type="dxa" w:w="2880"/>
+            <w:tcW w:type="dxa" w:w="3600"/>
             <w:vAlign w:val="center"/>
             <w:tcMar>
-              <w:top w:w="90" w:type="dxa"/>
-              <w:bottom w:w="90" w:type="dxa"/>
-              <w:left w:w="110" w:type="dxa"/>
-              <w:right w:w="110" w:type="dxa"/>
-            </w:tcMar>
-            <w:shd w:fill="FFFFFF"/>
-          </w:tcPr>
-          <w:p>
-            <w:pPr>
-              <w:spacing w:after="0"/>
-              <w:jc w:val="center"/>
-            </w:pPr>
-            <w:r>
-              <w:rPr>
-                <w:b/>
-                <w:color w:val="0F2744"/>
-                <w:sz w:val="17"/>
-              </w:rPr>
-              <w:t>Included</w:t>
-            </w:r>
-          </w:p>
-        </w:tc>
-      </w:tr>
-      <w:tr>
-        <w:tc>
-          <w:tcPr>
-            <w:tcW w:type="dxa" w:w="4896"/>
-            <w:vAlign w:val="center"/>
-            <w:tcMar>
-              <w:top w:w="90" w:type="dxa"/>
-              <w:bottom w:w="90" w:type="dxa"/>
-              <w:left w:w="110" w:type="dxa"/>
-              <w:right w:w="110" w:type="dxa"/>
+              <w:top w:w="80" w:type="dxa"/>
+              <w:bottom w:w="80" w:type="dxa"/>
+              <w:left w:w="100" w:type="dxa"/>
+              <w:right w:w="100" w:type="dxa"/>
             </w:tcMar>
             <w:shd w:fill="F8FAFC"/>
           </w:tcPr>
@@ -463,26 +568,52 @@
                 <w:color w:val="1E293B"/>
                 <w:sz w:val="17"/>
               </w:rPr>
-              <w:t>Staff Self-Service Portal &amp; Real-Time Balance Ledgers</w:t>
+              <w:t>5 Core Firm Categories (VL, SL, Emergency, Bereavement, LWOP)</w:t>
             </w:r>
           </w:p>
         </w:tc>
         <w:tc>
           <w:tcPr>
-            <w:tcW w:type="dxa" w:w="2592"/>
+            <w:tcW w:type="dxa" w:w="3888"/>
             <w:vAlign w:val="center"/>
             <w:tcMar>
-              <w:top w:w="90" w:type="dxa"/>
-              <w:bottom w:w="90" w:type="dxa"/>
-              <w:left w:w="110" w:type="dxa"/>
-              <w:right w:w="110" w:type="dxa"/>
+              <w:top w:w="80" w:type="dxa"/>
+              <w:bottom w:w="80" w:type="dxa"/>
+              <w:left w:w="100" w:type="dxa"/>
+              <w:right w:w="100" w:type="dxa"/>
             </w:tcMar>
-            <w:shd w:fill="F8FAFC"/>
+            <w:shd w:fill="F0FDF4"/>
           </w:tcPr>
           <w:p>
             <w:pPr>
               <w:spacing w:after="0"/>
-              <w:jc w:val="center"/>
+            </w:pPr>
+            <w:r>
+              <w:rPr>
+                <w:color w:val="1E293B"/>
+                <w:sz w:val="17"/>
+              </w:rPr>
+              <w:t>Full 12 Statutory &amp; Firm Categories (Solo Parent, Maternity, Paternity, Special Women, VAWC, CPD Study, etc.)</w:t>
+            </w:r>
+          </w:p>
+        </w:tc>
+      </w:tr>
+      <w:tr>
+        <w:tc>
+          <w:tcPr>
+            <w:tcW w:type="dxa" w:w="2880"/>
+            <w:vAlign w:val="center"/>
+            <w:tcMar>
+              <w:top w:w="80" w:type="dxa"/>
+              <w:bottom w:w="80" w:type="dxa"/>
+              <w:left w:w="100" w:type="dxa"/>
+              <w:right w:w="100" w:type="dxa"/>
+            </w:tcMar>
+            <w:shd w:fill="FFFFFF"/>
+          </w:tcPr>
+          <w:p>
+            <w:pPr>
+              <w:spacing w:after="0"/>
             </w:pPr>
             <w:r>
               <w:rPr>
@@ -490,48 +621,19 @@
                 <w:color w:val="0F2744"/>
                 <w:sz w:val="17"/>
               </w:rPr>
-              <w:t>Included</w:t>
+              <w:t>Semi-Monthly Payroll Sync</w:t>
             </w:r>
           </w:p>
         </w:tc>
         <w:tc>
           <w:tcPr>
-            <w:tcW w:type="dxa" w:w="2880"/>
+            <w:tcW w:type="dxa" w:w="3600"/>
             <w:vAlign w:val="center"/>
             <w:tcMar>
-              <w:top w:w="90" w:type="dxa"/>
-              <w:bottom w:w="90" w:type="dxa"/>
-              <w:left w:w="110" w:type="dxa"/>
-              <w:right w:w="110" w:type="dxa"/>
-            </w:tcMar>
-            <w:shd w:fill="F8FAFC"/>
-          </w:tcPr>
-          <w:p>
-            <w:pPr>
-              <w:spacing w:after="0"/>
-              <w:jc w:val="center"/>
-            </w:pPr>
-            <w:r>
-              <w:rPr>
-                <w:b/>
-                <w:color w:val="0F2744"/>
-                <w:sz w:val="17"/>
-              </w:rPr>
-              <w:t>Included</w:t>
-            </w:r>
-          </w:p>
-        </w:tc>
-      </w:tr>
-      <w:tr>
-        <w:tc>
-          <w:tcPr>
-            <w:tcW w:type="dxa" w:w="4896"/>
-            <w:vAlign w:val="center"/>
-            <w:tcMar>
-              <w:top w:w="90" w:type="dxa"/>
-              <w:bottom w:w="90" w:type="dxa"/>
-              <w:left w:w="110" w:type="dxa"/>
-              <w:right w:w="110" w:type="dxa"/>
+              <w:top w:w="80" w:type="dxa"/>
+              <w:bottom w:w="80" w:type="dxa"/>
+              <w:left w:w="100" w:type="dxa"/>
+              <w:right w:w="100" w:type="dxa"/>
             </w:tcMar>
             <w:shd w:fill="FFFFFF"/>
           </w:tcPr>
@@ -544,26 +646,52 @@
                 <w:color w:val="1E293B"/>
                 <w:sz w:val="17"/>
               </w:rPr>
-              <w:t>Managing Partner Approval &amp; Decision Review Queue</w:t>
+              <w:t>Manual Entry from Ledger Table</w:t>
             </w:r>
           </w:p>
         </w:tc>
         <w:tc>
           <w:tcPr>
-            <w:tcW w:type="dxa" w:w="2592"/>
+            <w:tcW w:type="dxa" w:w="3888"/>
             <w:vAlign w:val="center"/>
             <w:tcMar>
-              <w:top w:w="90" w:type="dxa"/>
-              <w:bottom w:w="90" w:type="dxa"/>
-              <w:left w:w="110" w:type="dxa"/>
-              <w:right w:w="110" w:type="dxa"/>
+              <w:top w:w="80" w:type="dxa"/>
+              <w:bottom w:w="80" w:type="dxa"/>
+              <w:left w:w="100" w:type="dxa"/>
+              <w:right w:w="100" w:type="dxa"/>
             </w:tcMar>
-            <w:shd w:fill="FFFFFF"/>
+            <w:shd w:fill="F0FDF4"/>
           </w:tcPr>
           <w:p>
             <w:pPr>
               <w:spacing w:after="0"/>
-              <w:jc w:val="center"/>
+            </w:pPr>
+            <w:r>
+              <w:rPr>
+                <w:color w:val="1E293B"/>
+                <w:sz w:val="17"/>
+              </w:rPr>
+              <w:t>1-Click Formatted Payroll CSV Export (JuanTax, Sprout Solutions, QuickBooks, Excel) with Auto-Deductions</w:t>
+            </w:r>
+          </w:p>
+        </w:tc>
+      </w:tr>
+      <w:tr>
+        <w:tc>
+          <w:tcPr>
+            <w:tcW w:type="dxa" w:w="2880"/>
+            <w:vAlign w:val="center"/>
+            <w:tcMar>
+              <w:top w:w="80" w:type="dxa"/>
+              <w:bottom w:w="80" w:type="dxa"/>
+              <w:left w:w="100" w:type="dxa"/>
+              <w:right w:w="100" w:type="dxa"/>
+            </w:tcMar>
+            <w:shd w:fill="F8FAFC"/>
+          </w:tcPr>
+          <w:p>
+            <w:pPr>
+              <w:spacing w:after="0"/>
             </w:pPr>
             <w:r>
               <w:rPr>
@@ -571,48 +699,19 @@
                 <w:color w:val="0F2744"/>
                 <w:sz w:val="17"/>
               </w:rPr>
-              <w:t>Included</w:t>
+              <w:t>Owner Year-End Cash Liabilities</w:t>
             </w:r>
           </w:p>
         </w:tc>
         <w:tc>
           <w:tcPr>
-            <w:tcW w:type="dxa" w:w="2880"/>
+            <w:tcW w:type="dxa" w:w="3600"/>
             <w:vAlign w:val="center"/>
             <w:tcMar>
-              <w:top w:w="90" w:type="dxa"/>
-              <w:bottom w:w="90" w:type="dxa"/>
-              <w:left w:w="110" w:type="dxa"/>
-              <w:right w:w="110" w:type="dxa"/>
-            </w:tcMar>
-            <w:shd w:fill="FFFFFF"/>
-          </w:tcPr>
-          <w:p>
-            <w:pPr>
-              <w:spacing w:after="0"/>
-              <w:jc w:val="center"/>
-            </w:pPr>
-            <w:r>
-              <w:rPr>
-                <w:b/>
-                <w:color w:val="0F2744"/>
-                <w:sz w:val="17"/>
-              </w:rPr>
-              <w:t>Included</w:t>
-            </w:r>
-          </w:p>
-        </w:tc>
-      </w:tr>
-      <w:tr>
-        <w:tc>
-          <w:tcPr>
-            <w:tcW w:type="dxa" w:w="4896"/>
-            <w:vAlign w:val="center"/>
-            <w:tcMar>
-              <w:top w:w="90" w:type="dxa"/>
-              <w:bottom w:w="90" w:type="dxa"/>
-              <w:left w:w="110" w:type="dxa"/>
-              <w:right w:w="110" w:type="dxa"/>
+              <w:top w:w="80" w:type="dxa"/>
+              <w:bottom w:w="80" w:type="dxa"/>
+              <w:left w:w="100" w:type="dxa"/>
+              <w:right w:w="100" w:type="dxa"/>
             </w:tcMar>
             <w:shd w:fill="F8FAFC"/>
           </w:tcPr>
@@ -625,26 +724,52 @@
                 <w:color w:val="1E293B"/>
                 <w:sz w:val="17"/>
               </w:rPr>
-              <w:t>Managing Partner Filing On Behalf of Any Employee</w:t>
+              <w:t>Manual Computation per Staff</w:t>
             </w:r>
           </w:p>
         </w:tc>
         <w:tc>
           <w:tcPr>
-            <w:tcW w:type="dxa" w:w="2592"/>
+            <w:tcW w:type="dxa" w:w="3888"/>
             <w:vAlign w:val="center"/>
             <w:tcMar>
-              <w:top w:w="90" w:type="dxa"/>
-              <w:bottom w:w="90" w:type="dxa"/>
-              <w:left w:w="110" w:type="dxa"/>
-              <w:right w:w="110" w:type="dxa"/>
+              <w:top w:w="80" w:type="dxa"/>
+              <w:bottom w:w="80" w:type="dxa"/>
+              <w:left w:w="100" w:type="dxa"/>
+              <w:right w:w="100" w:type="dxa"/>
             </w:tcMar>
-            <w:shd w:fill="F8FAFC"/>
+            <w:shd w:fill="F0FDF4"/>
           </w:tcPr>
           <w:p>
             <w:pPr>
               <w:spacing w:after="0"/>
-              <w:jc w:val="center"/>
+            </w:pPr>
+            <w:r>
+              <w:rPr>
+                <w:color w:val="1E293B"/>
+                <w:sz w:val="17"/>
+              </w:rPr>
+              <w:t>Automated Real-Time Leave Cash Conversion Ledger (Live Year-End Cash Payout Liability Forecast for 5 Staff)</w:t>
+            </w:r>
+          </w:p>
+        </w:tc>
+      </w:tr>
+      <w:tr>
+        <w:tc>
+          <w:tcPr>
+            <w:tcW w:type="dxa" w:w="2880"/>
+            <w:vAlign w:val="center"/>
+            <w:tcMar>
+              <w:top w:w="80" w:type="dxa"/>
+              <w:bottom w:w="80" w:type="dxa"/>
+              <w:left w:w="100" w:type="dxa"/>
+              <w:right w:w="100" w:type="dxa"/>
+            </w:tcMar>
+            <w:shd w:fill="FFFFFF"/>
+          </w:tcPr>
+          <w:p>
+            <w:pPr>
+              <w:spacing w:after="0"/>
             </w:pPr>
             <w:r>
               <w:rPr>
@@ -652,48 +777,19 @@
                 <w:color w:val="0F2744"/>
                 <w:sz w:val="17"/>
               </w:rPr>
-              <w:t>Included</w:t>
+              <w:t>Firm Coverage &amp; Scheduling</w:t>
             </w:r>
           </w:p>
         </w:tc>
         <w:tc>
           <w:tcPr>
-            <w:tcW w:type="dxa" w:w="2880"/>
+            <w:tcW w:type="dxa" w:w="3600"/>
             <w:vAlign w:val="center"/>
             <w:tcMar>
-              <w:top w:w="90" w:type="dxa"/>
-              <w:bottom w:w="90" w:type="dxa"/>
-              <w:left w:w="110" w:type="dxa"/>
-              <w:right w:w="110" w:type="dxa"/>
-            </w:tcMar>
-            <w:shd w:fill="F8FAFC"/>
-          </w:tcPr>
-          <w:p>
-            <w:pPr>
-              <w:spacing w:after="0"/>
-              <w:jc w:val="center"/>
-            </w:pPr>
-            <w:r>
-              <w:rPr>
-                <w:b/>
-                <w:color w:val="0F2744"/>
-                <w:sz w:val="17"/>
-              </w:rPr>
-              <w:t>Included</w:t>
-            </w:r>
-          </w:p>
-        </w:tc>
-      </w:tr>
-      <w:tr>
-        <w:tc>
-          <w:tcPr>
-            <w:tcW w:type="dxa" w:w="4896"/>
-            <w:vAlign w:val="center"/>
-            <w:tcMar>
-              <w:top w:w="90" w:type="dxa"/>
-              <w:bottom w:w="90" w:type="dxa"/>
-              <w:left w:w="110" w:type="dxa"/>
-              <w:right w:w="110" w:type="dxa"/>
+              <w:top w:w="80" w:type="dxa"/>
+              <w:bottom w:w="80" w:type="dxa"/>
+              <w:left w:w="100" w:type="dxa"/>
+              <w:right w:w="100" w:type="dxa"/>
             </w:tcMar>
             <w:shd w:fill="FFFFFF"/>
           </w:tcPr>
@@ -706,26 +802,52 @@
                 <w:color w:val="1E293B"/>
                 <w:sz w:val="17"/>
               </w:rPr>
-              <w:t>Clean Leave Application Details &amp; Partner Status Modal</w:t>
+              <w:t>Standard History List</w:t>
             </w:r>
           </w:p>
         </w:tc>
         <w:tc>
           <w:tcPr>
-            <w:tcW w:type="dxa" w:w="2592"/>
+            <w:tcW w:type="dxa" w:w="3888"/>
             <w:vAlign w:val="center"/>
             <w:tcMar>
-              <w:top w:w="90" w:type="dxa"/>
-              <w:bottom w:w="90" w:type="dxa"/>
-              <w:left w:w="110" w:type="dxa"/>
-              <w:right w:w="110" w:type="dxa"/>
+              <w:top w:w="80" w:type="dxa"/>
+              <w:bottom w:w="80" w:type="dxa"/>
+              <w:left w:w="100" w:type="dxa"/>
+              <w:right w:w="100" w:type="dxa"/>
             </w:tcMar>
-            <w:shd w:fill="FFFFFF"/>
+            <w:shd w:fill="F0FDF4"/>
           </w:tcPr>
           <w:p>
             <w:pPr>
               <w:spacing w:after="0"/>
-              <w:jc w:val="center"/>
+            </w:pPr>
+            <w:r>
+              <w:rPr>
+                <w:color w:val="1E293B"/>
+                <w:sz w:val="17"/>
+              </w:rPr>
+              <w:t>Interactive 6-Person Team Absence Calendar (Visual Coverage Tracker to Prevent Overlapping Absences)</w:t>
+            </w:r>
+          </w:p>
+        </w:tc>
+      </w:tr>
+      <w:tr>
+        <w:tc>
+          <w:tcPr>
+            <w:tcW w:type="dxa" w:w="2880"/>
+            <w:vAlign w:val="center"/>
+            <w:tcMar>
+              <w:top w:w="80" w:type="dxa"/>
+              <w:bottom w:w="80" w:type="dxa"/>
+              <w:left w:w="100" w:type="dxa"/>
+              <w:right w:w="100" w:type="dxa"/>
+            </w:tcMar>
+            <w:shd w:fill="F8FAFC"/>
+          </w:tcPr>
+          <w:p>
+            <w:pPr>
+              <w:spacing w:after="0"/>
             </w:pPr>
             <w:r>
               <w:rPr>
@@ -733,48 +855,19 @@
                 <w:color w:val="0F2744"/>
                 <w:sz w:val="17"/>
               </w:rPr>
-              <w:t>Included</w:t>
+              <w:t>Medical Proof Verification</w:t>
             </w:r>
           </w:p>
         </w:tc>
         <w:tc>
           <w:tcPr>
-            <w:tcW w:type="dxa" w:w="2880"/>
+            <w:tcW w:type="dxa" w:w="3600"/>
             <w:vAlign w:val="center"/>
             <w:tcMar>
-              <w:top w:w="90" w:type="dxa"/>
-              <w:bottom w:w="90" w:type="dxa"/>
-              <w:left w:w="110" w:type="dxa"/>
-              <w:right w:w="110" w:type="dxa"/>
-            </w:tcMar>
-            <w:shd w:fill="FFFFFF"/>
-          </w:tcPr>
-          <w:p>
-            <w:pPr>
-              <w:spacing w:after="0"/>
-              <w:jc w:val="center"/>
-            </w:pPr>
-            <w:r>
-              <w:rPr>
-                <w:b/>
-                <w:color w:val="0F2744"/>
-                <w:sz w:val="17"/>
-              </w:rPr>
-              <w:t>Included</w:t>
-            </w:r>
-          </w:p>
-        </w:tc>
-      </w:tr>
-      <w:tr>
-        <w:tc>
-          <w:tcPr>
-            <w:tcW w:type="dxa" w:w="4896"/>
-            <w:vAlign w:val="center"/>
-            <w:tcMar>
-              <w:top w:w="90" w:type="dxa"/>
-              <w:bottom w:w="90" w:type="dxa"/>
-              <w:left w:w="110" w:type="dxa"/>
-              <w:right w:w="110" w:type="dxa"/>
+              <w:top w:w="80" w:type="dxa"/>
+              <w:bottom w:w="80" w:type="dxa"/>
+              <w:left w:w="100" w:type="dxa"/>
+              <w:right w:w="100" w:type="dxa"/>
             </w:tcMar>
             <w:shd w:fill="F8FAFC"/>
           </w:tcPr>
@@ -787,60 +880,32 @@
                 <w:color w:val="1E293B"/>
                 <w:sz w:val="17"/>
               </w:rPr>
-              <w:t>Automated Holiday &amp; Working Days Exclusion Engine</w:t>
+              <w:t>Physical Paper Note Submission</w:t>
             </w:r>
           </w:p>
         </w:tc>
         <w:tc>
           <w:tcPr>
-            <w:tcW w:type="dxa" w:w="2592"/>
+            <w:tcW w:type="dxa" w:w="3888"/>
             <w:vAlign w:val="center"/>
             <w:tcMar>
-              <w:top w:w="90" w:type="dxa"/>
-              <w:bottom w:w="90" w:type="dxa"/>
-              <w:left w:w="110" w:type="dxa"/>
-              <w:right w:w="110" w:type="dxa"/>
-            </w:tcMar>
-            <w:shd w:fill="F8FAFC"/>
-          </w:tcPr>
-          <w:p>
-            <w:pPr>
-              <w:spacing w:after="0"/>
-              <w:jc w:val="center"/>
-            </w:pPr>
-            <w:r>
-              <w:rPr>
-                <w:color w:val="64748B"/>
-                <w:sz w:val="17"/>
-              </w:rPr>
-              <w:t>—</w:t>
-            </w:r>
-          </w:p>
-        </w:tc>
-        <w:tc>
-          <w:tcPr>
-            <w:tcW w:type="dxa" w:w="2880"/>
-            <w:vAlign w:val="center"/>
-            <w:tcMar>
-              <w:top w:w="90" w:type="dxa"/>
-              <w:bottom w:w="90" w:type="dxa"/>
-              <w:left w:w="110" w:type="dxa"/>
-              <w:right w:w="110" w:type="dxa"/>
+              <w:top w:w="80" w:type="dxa"/>
+              <w:bottom w:w="80" w:type="dxa"/>
+              <w:left w:w="100" w:type="dxa"/>
+              <w:right w:w="100" w:type="dxa"/>
             </w:tcMar>
             <w:shd w:fill="F0FDF4"/>
           </w:tcPr>
           <w:p>
             <w:pPr>
               <w:spacing w:after="0"/>
-              <w:jc w:val="center"/>
             </w:pPr>
             <w:r>
               <w:rPr>
-                <w:b/>
-                <w:color w:val="10B981"/>
+                <w:color w:val="1E293B"/>
                 <w:sz w:val="17"/>
               </w:rPr>
-              <w:t>INCLUDED (Auto-Excludes Weekends &amp; Official Holidays)</w:t>
+              <w:t>In-App Medical Certificate &amp; Document Proof Uploader with 1-Click Secure In-App Viewer</w:t>
             </w:r>
           </w:p>
         </w:tc>
@@ -848,13 +913,39 @@
       <w:tr>
         <w:tc>
           <w:tcPr>
-            <w:tcW w:type="dxa" w:w="4896"/>
+            <w:tcW w:type="dxa" w:w="2880"/>
             <w:vAlign w:val="center"/>
             <w:tcMar>
-              <w:top w:w="90" w:type="dxa"/>
-              <w:bottom w:w="90" w:type="dxa"/>
-              <w:left w:w="110" w:type="dxa"/>
-              <w:right w:w="110" w:type="dxa"/>
+              <w:top w:w="80" w:type="dxa"/>
+              <w:bottom w:w="80" w:type="dxa"/>
+              <w:left w:w="100" w:type="dxa"/>
+              <w:right w:w="100" w:type="dxa"/>
+            </w:tcMar>
+            <w:shd w:fill="FFFFFF"/>
+          </w:tcPr>
+          <w:p>
+            <w:pPr>
+              <w:spacing w:after="0"/>
+            </w:pPr>
+            <w:r>
+              <w:rPr>
+                <w:b/>
+                <w:color w:val="0F2744"/>
+                <w:sz w:val="17"/>
+              </w:rPr>
+              <w:t>Compliance &amp; Audit Records</w:t>
+            </w:r>
+          </w:p>
+        </w:tc>
+        <w:tc>
+          <w:tcPr>
+            <w:tcW w:type="dxa" w:w="3600"/>
+            <w:vAlign w:val="center"/>
+            <w:tcMar>
+              <w:top w:w="80" w:type="dxa"/>
+              <w:bottom w:w="80" w:type="dxa"/>
+              <w:left w:w="100" w:type="dxa"/>
+              <w:right w:w="100" w:type="dxa"/>
             </w:tcMar>
             <w:shd w:fill="FFFFFF"/>
           </w:tcPr>
@@ -867,60 +958,32 @@
                 <w:color w:val="1E293B"/>
                 <w:sz w:val="17"/>
               </w:rPr>
-              <w:t>Peak Tax Season (March 15 - April 15) Blackout Warnings</w:t>
+              <w:t>Standard Application Database Logs</w:t>
             </w:r>
           </w:p>
         </w:tc>
         <w:tc>
           <w:tcPr>
-            <w:tcW w:type="dxa" w:w="2592"/>
+            <w:tcW w:type="dxa" w:w="3888"/>
             <w:vAlign w:val="center"/>
             <w:tcMar>
-              <w:top w:w="90" w:type="dxa"/>
-              <w:bottom w:w="90" w:type="dxa"/>
-              <w:left w:w="110" w:type="dxa"/>
-              <w:right w:w="110" w:type="dxa"/>
-            </w:tcMar>
-            <w:shd w:fill="FFFFFF"/>
-          </w:tcPr>
-          <w:p>
-            <w:pPr>
-              <w:spacing w:after="0"/>
-              <w:jc w:val="center"/>
-            </w:pPr>
-            <w:r>
-              <w:rPr>
-                <w:color w:val="64748B"/>
-                <w:sz w:val="17"/>
-              </w:rPr>
-              <w:t>—</w:t>
-            </w:r>
-          </w:p>
-        </w:tc>
-        <w:tc>
-          <w:tcPr>
-            <w:tcW w:type="dxa" w:w="2880"/>
-            <w:vAlign w:val="center"/>
-            <w:tcMar>
-              <w:top w:w="90" w:type="dxa"/>
-              <w:bottom w:w="90" w:type="dxa"/>
-              <w:left w:w="110" w:type="dxa"/>
-              <w:right w:w="110" w:type="dxa"/>
+              <w:top w:w="80" w:type="dxa"/>
+              <w:bottom w:w="80" w:type="dxa"/>
+              <w:left w:w="100" w:type="dxa"/>
+              <w:right w:w="100" w:type="dxa"/>
             </w:tcMar>
             <w:shd w:fill="F0FDF4"/>
           </w:tcPr>
           <w:p>
             <w:pPr>
               <w:spacing w:after="0"/>
-              <w:jc w:val="center"/>
             </w:pPr>
             <w:r>
               <w:rPr>
-                <w:b/>
-                <w:color w:val="10B981"/>
+                <w:color w:val="1E293B"/>
                 <w:sz w:val="17"/>
               </w:rPr>
-              <w:t>INCLUDED (Client Engagement Protection)</w:t>
+              <w:t>Immutable Enterprise Audit Trail with IP Tracking, Timestamps, and Action Histories</w:t>
             </w:r>
           </w:p>
         </w:tc>
@@ -928,13 +991,39 @@
       <w:tr>
         <w:tc>
           <w:tcPr>
-            <w:tcW w:type="dxa" w:w="4896"/>
+            <w:tcW w:type="dxa" w:w="2880"/>
             <w:vAlign w:val="center"/>
             <w:tcMar>
-              <w:top w:w="90" w:type="dxa"/>
-              <w:bottom w:w="90" w:type="dxa"/>
-              <w:left w:w="110" w:type="dxa"/>
-              <w:right w:w="110" w:type="dxa"/>
+              <w:top w:w="80" w:type="dxa"/>
+              <w:bottom w:w="80" w:type="dxa"/>
+              <w:left w:w="100" w:type="dxa"/>
+              <w:right w:w="100" w:type="dxa"/>
+            </w:tcMar>
+            <w:shd w:fill="F8FAFC"/>
+          </w:tcPr>
+          <w:p>
+            <w:pPr>
+              <w:spacing w:after="0"/>
+            </w:pPr>
+            <w:r>
+              <w:rPr>
+                <w:b/>
+                <w:color w:val="0F2744"/>
+                <w:sz w:val="17"/>
+              </w:rPr>
+              <w:t>Real-Time Staff Alerts</w:t>
+            </w:r>
+          </w:p>
+        </w:tc>
+        <w:tc>
+          <w:tcPr>
+            <w:tcW w:type="dxa" w:w="3600"/>
+            <w:vAlign w:val="center"/>
+            <w:tcMar>
+              <w:top w:w="80" w:type="dxa"/>
+              <w:bottom w:w="80" w:type="dxa"/>
+              <w:left w:w="100" w:type="dxa"/>
+              <w:right w:w="100" w:type="dxa"/>
             </w:tcMar>
             <w:shd w:fill="F8FAFC"/>
           </w:tcPr>
@@ -947,60 +1036,32 @@
                 <w:color w:val="1E293B"/>
                 <w:sz w:val="17"/>
               </w:rPr>
-              <w:t>Interactive Multi-Department Absence Calendar &amp; Schedule Sync</w:t>
+              <w:t>In-App Dashboard Notifications</w:t>
             </w:r>
           </w:p>
         </w:tc>
         <w:tc>
           <w:tcPr>
-            <w:tcW w:type="dxa" w:w="2592"/>
+            <w:tcW w:type="dxa" w:w="3888"/>
             <w:vAlign w:val="center"/>
             <w:tcMar>
-              <w:top w:w="90" w:type="dxa"/>
-              <w:bottom w:w="90" w:type="dxa"/>
-              <w:left w:w="110" w:type="dxa"/>
-              <w:right w:w="110" w:type="dxa"/>
-            </w:tcMar>
-            <w:shd w:fill="F8FAFC"/>
-          </w:tcPr>
-          <w:p>
-            <w:pPr>
-              <w:spacing w:after="0"/>
-              <w:jc w:val="center"/>
-            </w:pPr>
-            <w:r>
-              <w:rPr>
-                <w:color w:val="64748B"/>
-                <w:sz w:val="17"/>
-              </w:rPr>
-              <w:t>—</w:t>
-            </w:r>
-          </w:p>
-        </w:tc>
-        <w:tc>
-          <w:tcPr>
-            <w:tcW w:type="dxa" w:w="2880"/>
-            <w:vAlign w:val="center"/>
-            <w:tcMar>
-              <w:top w:w="90" w:type="dxa"/>
-              <w:bottom w:w="90" w:type="dxa"/>
-              <w:left w:w="110" w:type="dxa"/>
-              <w:right w:w="110" w:type="dxa"/>
+              <w:top w:w="80" w:type="dxa"/>
+              <w:bottom w:w="80" w:type="dxa"/>
+              <w:left w:w="100" w:type="dxa"/>
+              <w:right w:w="100" w:type="dxa"/>
             </w:tcMar>
             <w:shd w:fill="F0FDF4"/>
           </w:tcPr>
           <w:p>
             <w:pPr>
               <w:spacing w:after="0"/>
-              <w:jc w:val="center"/>
             </w:pPr>
             <w:r>
               <w:rPr>
-                <w:b/>
-                <w:color w:val="10B981"/>
+                <w:color w:val="1E293B"/>
                 <w:sz w:val="17"/>
               </w:rPr>
-              <w:t>INCLUDED (Visual Schedule)</w:t>
+              <w:t>Automated Real-Time Transactional Email Alerts (Filing, Approvals, Rejections)</w:t>
             </w:r>
           </w:p>
         </w:tc>
@@ -1008,13 +1069,39 @@
       <w:tr>
         <w:tc>
           <w:tcPr>
-            <w:tcW w:type="dxa" w:w="4896"/>
+            <w:tcW w:type="dxa" w:w="2880"/>
             <w:vAlign w:val="center"/>
             <w:tcMar>
-              <w:top w:w="90" w:type="dxa"/>
-              <w:bottom w:w="90" w:type="dxa"/>
-              <w:left w:w="110" w:type="dxa"/>
-              <w:right w:w="110" w:type="dxa"/>
+              <w:top w:w="80" w:type="dxa"/>
+              <w:bottom w:w="80" w:type="dxa"/>
+              <w:left w:w="100" w:type="dxa"/>
+              <w:right w:w="100" w:type="dxa"/>
+            </w:tcMar>
+            <w:shd w:fill="FFFFFF"/>
+          </w:tcPr>
+          <w:p>
+            <w:pPr>
+              <w:spacing w:after="0"/>
+            </w:pPr>
+            <w:r>
+              <w:rPr>
+                <w:b/>
+                <w:color w:val="0F2744"/>
+                <w:sz w:val="17"/>
+              </w:rPr>
+              <w:t>Working Days Calculation</w:t>
+            </w:r>
+          </w:p>
+        </w:tc>
+        <w:tc>
+          <w:tcPr>
+            <w:tcW w:type="dxa" w:w="3600"/>
+            <w:vAlign w:val="center"/>
+            <w:tcMar>
+              <w:top w:w="80" w:type="dxa"/>
+              <w:bottom w:w="80" w:type="dxa"/>
+              <w:left w:w="100" w:type="dxa"/>
+              <w:right w:w="100" w:type="dxa"/>
             </w:tcMar>
             <w:shd w:fill="FFFFFF"/>
           </w:tcPr>
@@ -1027,60 +1114,32 @@
                 <w:color w:val="1E293B"/>
                 <w:sz w:val="17"/>
               </w:rPr>
-              <w:t>Medical Certificate &amp; Document Proof Upload &amp; In-App Viewer</w:t>
+              <w:t>Consecutive Calendar Days Math</w:t>
             </w:r>
           </w:p>
         </w:tc>
         <w:tc>
           <w:tcPr>
-            <w:tcW w:type="dxa" w:w="2592"/>
+            <w:tcW w:type="dxa" w:w="3888"/>
             <w:vAlign w:val="center"/>
             <w:tcMar>
-              <w:top w:w="90" w:type="dxa"/>
-              <w:bottom w:w="90" w:type="dxa"/>
-              <w:left w:w="110" w:type="dxa"/>
-              <w:right w:w="110" w:type="dxa"/>
-            </w:tcMar>
-            <w:shd w:fill="FFFFFF"/>
-          </w:tcPr>
-          <w:p>
-            <w:pPr>
-              <w:spacing w:after="0"/>
-              <w:jc w:val="center"/>
-            </w:pPr>
-            <w:r>
-              <w:rPr>
-                <w:color w:val="64748B"/>
-                <w:sz w:val="17"/>
-              </w:rPr>
-              <w:t>—</w:t>
-            </w:r>
-          </w:p>
-        </w:tc>
-        <w:tc>
-          <w:tcPr>
-            <w:tcW w:type="dxa" w:w="2880"/>
-            <w:vAlign w:val="center"/>
-            <w:tcMar>
-              <w:top w:w="90" w:type="dxa"/>
-              <w:bottom w:w="90" w:type="dxa"/>
-              <w:left w:w="110" w:type="dxa"/>
-              <w:right w:w="110" w:type="dxa"/>
+              <w:top w:w="80" w:type="dxa"/>
+              <w:bottom w:w="80" w:type="dxa"/>
+              <w:left w:w="100" w:type="dxa"/>
+              <w:right w:w="100" w:type="dxa"/>
             </w:tcMar>
             <w:shd w:fill="F0FDF4"/>
           </w:tcPr>
           <w:p>
             <w:pPr>
               <w:spacing w:after="0"/>
-              <w:jc w:val="center"/>
             </w:pPr>
             <w:r>
               <w:rPr>
-                <w:b/>
-                <w:color w:val="10B981"/>
+                <w:color w:val="1E293B"/>
                 <w:sz w:val="17"/>
               </w:rPr>
-              <w:t>INCLUDED (Verification Engine)</w:t>
+              <w:t>Automated Working Days Engine (Auto-Excludes Weekends &amp; Official Regular/Special Holidays)</w:t>
             </w:r>
           </w:p>
         </w:tc>
@@ -1088,13 +1147,39 @@
       <w:tr>
         <w:tc>
           <w:tcPr>
-            <w:tcW w:type="dxa" w:w="4896"/>
+            <w:tcW w:type="dxa" w:w="2880"/>
             <w:vAlign w:val="center"/>
             <w:tcMar>
-              <w:top w:w="90" w:type="dxa"/>
-              <w:bottom w:w="90" w:type="dxa"/>
-              <w:left w:w="110" w:type="dxa"/>
-              <w:right w:w="110" w:type="dxa"/>
+              <w:top w:w="80" w:type="dxa"/>
+              <w:bottom w:w="80" w:type="dxa"/>
+              <w:left w:w="100" w:type="dxa"/>
+              <w:right w:w="100" w:type="dxa"/>
+            </w:tcMar>
+            <w:shd w:fill="F8FAFC"/>
+          </w:tcPr>
+          <w:p>
+            <w:pPr>
+              <w:spacing w:after="0"/>
+            </w:pPr>
+            <w:r>
+              <w:rPr>
+                <w:b/>
+                <w:color w:val="0F2744"/>
+                <w:sz w:val="17"/>
+              </w:rPr>
+              <w:t>Tax Season Blackout Advisory</w:t>
+            </w:r>
+          </w:p>
+        </w:tc>
+        <w:tc>
+          <w:tcPr>
+            <w:tcW w:type="dxa" w:w="3600"/>
+            <w:vAlign w:val="center"/>
+            <w:tcMar>
+              <w:top w:w="80" w:type="dxa"/>
+              <w:bottom w:w="80" w:type="dxa"/>
+              <w:left w:w="100" w:type="dxa"/>
+              <w:right w:w="100" w:type="dxa"/>
             </w:tcMar>
             <w:shd w:fill="F8FAFC"/>
           </w:tcPr>
@@ -1107,60 +1192,32 @@
                 <w:color w:val="1E293B"/>
                 <w:sz w:val="17"/>
               </w:rPr>
-              <w:t>Automated Formatted Payroll CSV Export (JuanTax / Sprout / QuickBooks)</w:t>
+              <w:t>Manual Owner Oversight</w:t>
             </w:r>
           </w:p>
         </w:tc>
         <w:tc>
           <w:tcPr>
-            <w:tcW w:type="dxa" w:w="2592"/>
+            <w:tcW w:type="dxa" w:w="3888"/>
             <w:vAlign w:val="center"/>
             <w:tcMar>
-              <w:top w:w="90" w:type="dxa"/>
-              <w:bottom w:w="90" w:type="dxa"/>
-              <w:left w:w="110" w:type="dxa"/>
-              <w:right w:w="110" w:type="dxa"/>
-            </w:tcMar>
-            <w:shd w:fill="F8FAFC"/>
-          </w:tcPr>
-          <w:p>
-            <w:pPr>
-              <w:spacing w:after="0"/>
-              <w:jc w:val="center"/>
-            </w:pPr>
-            <w:r>
-              <w:rPr>
-                <w:color w:val="64748B"/>
-                <w:sz w:val="17"/>
-              </w:rPr>
-              <w:t>—</w:t>
-            </w:r>
-          </w:p>
-        </w:tc>
-        <w:tc>
-          <w:tcPr>
-            <w:tcW w:type="dxa" w:w="2880"/>
-            <w:vAlign w:val="center"/>
-            <w:tcMar>
-              <w:top w:w="90" w:type="dxa"/>
-              <w:bottom w:w="90" w:type="dxa"/>
-              <w:left w:w="110" w:type="dxa"/>
-              <w:right w:w="110" w:type="dxa"/>
+              <w:top w:w="80" w:type="dxa"/>
+              <w:bottom w:w="80" w:type="dxa"/>
+              <w:left w:w="100" w:type="dxa"/>
+              <w:right w:w="100" w:type="dxa"/>
             </w:tcMar>
             <w:shd w:fill="F0FDF4"/>
           </w:tcPr>
           <w:p>
             <w:pPr>
               <w:spacing w:after="0"/>
-              <w:jc w:val="center"/>
             </w:pPr>
             <w:r>
               <w:rPr>
-                <w:b/>
-                <w:color w:val="10B981"/>
+                <w:color w:val="1E293B"/>
                 <w:sz w:val="17"/>
               </w:rPr>
-              <w:t>INCLUDED (One-Click Sync)</w:t>
+              <w:t>Peak Tax Season Blackout Advisory Engine (Engagement Clearance Alerts for March 15 – April 15)</w:t>
             </w:r>
           </w:p>
         </w:tc>
@@ -1168,13 +1225,39 @@
       <w:tr>
         <w:tc>
           <w:tcPr>
-            <w:tcW w:type="dxa" w:w="4896"/>
+            <w:tcW w:type="dxa" w:w="2880"/>
             <w:vAlign w:val="center"/>
             <w:tcMar>
-              <w:top w:w="90" w:type="dxa"/>
-              <w:bottom w:w="90" w:type="dxa"/>
-              <w:left w:w="110" w:type="dxa"/>
-              <w:right w:w="110" w:type="dxa"/>
+              <w:top w:w="80" w:type="dxa"/>
+              <w:bottom w:w="80" w:type="dxa"/>
+              <w:left w:w="100" w:type="dxa"/>
+              <w:right w:w="100" w:type="dxa"/>
+            </w:tcMar>
+            <w:shd w:fill="FFFFFF"/>
+          </w:tcPr>
+          <w:p>
+            <w:pPr>
+              <w:spacing w:after="0"/>
+            </w:pPr>
+            <w:r>
+              <w:rPr>
+                <w:b/>
+                <w:color w:val="0F2744"/>
+                <w:sz w:val="17"/>
+              </w:rPr>
+              <w:t>Credit Accrual &amp; Rollover</w:t>
+            </w:r>
+          </w:p>
+        </w:tc>
+        <w:tc>
+          <w:tcPr>
+            <w:tcW w:type="dxa" w:w="3600"/>
+            <w:vAlign w:val="center"/>
+            <w:tcMar>
+              <w:top w:w="80" w:type="dxa"/>
+              <w:bottom w:w="80" w:type="dxa"/>
+              <w:left w:w="100" w:type="dxa"/>
+              <w:right w:w="100" w:type="dxa"/>
             </w:tcMar>
             <w:shd w:fill="FFFFFF"/>
           </w:tcPr>
@@ -1187,60 +1270,32 @@
                 <w:color w:val="1E293B"/>
                 <w:sz w:val="17"/>
               </w:rPr>
-              <w:t>Year-End Unused Leave Cash Conversion Ledger &amp; Reserve Calculator</w:t>
+              <w:t>Manual Yearly Balance Reset</w:t>
             </w:r>
           </w:p>
         </w:tc>
         <w:tc>
           <w:tcPr>
-            <w:tcW w:type="dxa" w:w="2592"/>
+            <w:tcW w:type="dxa" w:w="3888"/>
             <w:vAlign w:val="center"/>
             <w:tcMar>
-              <w:top w:w="90" w:type="dxa"/>
-              <w:bottom w:w="90" w:type="dxa"/>
-              <w:left w:w="110" w:type="dxa"/>
-              <w:right w:w="110" w:type="dxa"/>
-            </w:tcMar>
-            <w:shd w:fill="FFFFFF"/>
-          </w:tcPr>
-          <w:p>
-            <w:pPr>
-              <w:spacing w:after="0"/>
-              <w:jc w:val="center"/>
-            </w:pPr>
-            <w:r>
-              <w:rPr>
-                <w:color w:val="64748B"/>
-                <w:sz w:val="17"/>
-              </w:rPr>
-              <w:t>—</w:t>
-            </w:r>
-          </w:p>
-        </w:tc>
-        <w:tc>
-          <w:tcPr>
-            <w:tcW w:type="dxa" w:w="2880"/>
-            <w:vAlign w:val="center"/>
-            <w:tcMar>
-              <w:top w:w="90" w:type="dxa"/>
-              <w:bottom w:w="90" w:type="dxa"/>
-              <w:left w:w="110" w:type="dxa"/>
-              <w:right w:w="110" w:type="dxa"/>
+              <w:top w:w="80" w:type="dxa"/>
+              <w:bottom w:w="80" w:type="dxa"/>
+              <w:left w:w="100" w:type="dxa"/>
+              <w:right w:w="100" w:type="dxa"/>
             </w:tcMar>
             <w:shd w:fill="F0FDF4"/>
           </w:tcPr>
           <w:p>
             <w:pPr>
               <w:spacing w:after="0"/>
-              <w:jc w:val="center"/>
             </w:pPr>
             <w:r>
               <w:rPr>
-                <w:b/>
-                <w:color w:val="10B981"/>
+                <w:color w:val="1E293B"/>
                 <w:sz w:val="17"/>
               </w:rPr>
-              <w:t>INCLUDED (Live Liability Forecast)</w:t>
+              <w:t>Automated Monthly Accruals (+1.25d/mo) &amp; Annual Fiscal Year Rollover Engine</w:t>
             </w:r>
           </w:p>
         </w:tc>
@@ -1248,13 +1303,39 @@
       <w:tr>
         <w:tc>
           <w:tcPr>
-            <w:tcW w:type="dxa" w:w="4896"/>
+            <w:tcW w:type="dxa" w:w="2880"/>
             <w:vAlign w:val="center"/>
             <w:tcMar>
-              <w:top w:w="90" w:type="dxa"/>
-              <w:bottom w:w="90" w:type="dxa"/>
-              <w:left w:w="110" w:type="dxa"/>
-              <w:right w:w="110" w:type="dxa"/>
+              <w:top w:w="80" w:type="dxa"/>
+              <w:bottom w:w="80" w:type="dxa"/>
+              <w:left w:w="100" w:type="dxa"/>
+              <w:right w:w="100" w:type="dxa"/>
+            </w:tcMar>
+            <w:shd w:fill="F8FAFC"/>
+          </w:tcPr>
+          <w:p>
+            <w:pPr>
+              <w:spacing w:after="0"/>
+            </w:pPr>
+            <w:r>
+              <w:rPr>
+                <w:b/>
+                <w:color w:val="0F2744"/>
+                <w:sz w:val="17"/>
+              </w:rPr>
+              <w:t>Managing Partner Governance</w:t>
+            </w:r>
+          </w:p>
+        </w:tc>
+        <w:tc>
+          <w:tcPr>
+            <w:tcW w:type="dxa" w:w="3600"/>
+            <w:vAlign w:val="center"/>
+            <w:tcMar>
+              <w:top w:w="80" w:type="dxa"/>
+              <w:bottom w:w="80" w:type="dxa"/>
+              <w:left w:w="100" w:type="dxa"/>
+              <w:right w:w="100" w:type="dxa"/>
             </w:tcMar>
             <w:shd w:fill="F8FAFC"/>
           </w:tcPr>
@@ -1267,60 +1348,32 @@
                 <w:color w:val="1E293B"/>
                 <w:sz w:val="17"/>
               </w:rPr>
-              <w:t>Immutable Enterprise Audit Trail with Client IP Tracking</w:t>
+              <w:t>Approval Queue &amp; On-Behalf Filing</w:t>
             </w:r>
           </w:p>
         </w:tc>
         <w:tc>
           <w:tcPr>
-            <w:tcW w:type="dxa" w:w="2592"/>
+            <w:tcW w:type="dxa" w:w="3888"/>
             <w:vAlign w:val="center"/>
             <w:tcMar>
-              <w:top w:w="90" w:type="dxa"/>
-              <w:bottom w:w="90" w:type="dxa"/>
-              <w:left w:w="110" w:type="dxa"/>
-              <w:right w:w="110" w:type="dxa"/>
-            </w:tcMar>
-            <w:shd w:fill="F8FAFC"/>
-          </w:tcPr>
-          <w:p>
-            <w:pPr>
-              <w:spacing w:after="0"/>
-              <w:jc w:val="center"/>
-            </w:pPr>
-            <w:r>
-              <w:rPr>
-                <w:color w:val="64748B"/>
-                <w:sz w:val="17"/>
-              </w:rPr>
-              <w:t>—</w:t>
-            </w:r>
-          </w:p>
-        </w:tc>
-        <w:tc>
-          <w:tcPr>
-            <w:tcW w:type="dxa" w:w="2880"/>
-            <w:vAlign w:val="center"/>
-            <w:tcMar>
-              <w:top w:w="90" w:type="dxa"/>
-              <w:bottom w:w="90" w:type="dxa"/>
-              <w:left w:w="110" w:type="dxa"/>
-              <w:right w:w="110" w:type="dxa"/>
+              <w:top w:w="80" w:type="dxa"/>
+              <w:bottom w:w="80" w:type="dxa"/>
+              <w:left w:w="100" w:type="dxa"/>
+              <w:right w:w="100" w:type="dxa"/>
             </w:tcMar>
             <w:shd w:fill="F0FDF4"/>
           </w:tcPr>
           <w:p>
             <w:pPr>
               <w:spacing w:after="0"/>
-              <w:jc w:val="center"/>
             </w:pPr>
             <w:r>
               <w:rPr>
-                <w:b/>
-                <w:color w:val="10B981"/>
+                <w:color w:val="1E293B"/>
                 <w:sz w:val="17"/>
               </w:rPr>
-              <w:t>INCLUDED (Tamper-Proof)</w:t>
+              <w:t>Executive Approval Portal, Engagement Notes, Proxy Filing &amp; Roster Availability Overview</w:t>
             </w:r>
           </w:p>
         </w:tc>
@@ -1328,13 +1381,39 @@
       <w:tr>
         <w:tc>
           <w:tcPr>
-            <w:tcW w:type="dxa" w:w="4896"/>
+            <w:tcW w:type="dxa" w:w="2880"/>
             <w:vAlign w:val="center"/>
             <w:tcMar>
-              <w:top w:w="90" w:type="dxa"/>
-              <w:bottom w:w="90" w:type="dxa"/>
-              <w:left w:w="110" w:type="dxa"/>
-              <w:right w:w="110" w:type="dxa"/>
+              <w:top w:w="80" w:type="dxa"/>
+              <w:bottom w:w="80" w:type="dxa"/>
+              <w:left w:w="100" w:type="dxa"/>
+              <w:right w:w="100" w:type="dxa"/>
+            </w:tcMar>
+            <w:shd w:fill="FFFFFF"/>
+          </w:tcPr>
+          <w:p>
+            <w:pPr>
+              <w:spacing w:after="0"/>
+            </w:pPr>
+            <w:r>
+              <w:rPr>
+                <w:b/>
+                <w:color w:val="0F2744"/>
+                <w:sz w:val="17"/>
+              </w:rPr>
+              <w:t>Production Server Setup</w:t>
+            </w:r>
+          </w:p>
+        </w:tc>
+        <w:tc>
+          <w:tcPr>
+            <w:tcW w:type="dxa" w:w="3600"/>
+            <w:vAlign w:val="center"/>
+            <w:tcMar>
+              <w:top w:w="80" w:type="dxa"/>
+              <w:bottom w:w="80" w:type="dxa"/>
+              <w:left w:w="100" w:type="dxa"/>
+              <w:right w:w="100" w:type="dxa"/>
             </w:tcMar>
             <w:shd w:fill="FFFFFF"/>
           </w:tcPr>
@@ -1347,60 +1426,32 @@
                 <w:color w:val="1E293B"/>
                 <w:sz w:val="17"/>
               </w:rPr>
-              <w:t>Automated Real-Time Email Notifications &amp; Manager Alerts</w:t>
+              <w:t>Full Server Setup, Database Config &amp; SSL</w:t>
             </w:r>
           </w:p>
         </w:tc>
         <w:tc>
           <w:tcPr>
-            <w:tcW w:type="dxa" w:w="2592"/>
+            <w:tcW w:type="dxa" w:w="3888"/>
             <w:vAlign w:val="center"/>
             <w:tcMar>
-              <w:top w:w="90" w:type="dxa"/>
-              <w:bottom w:w="90" w:type="dxa"/>
-              <w:left w:w="110" w:type="dxa"/>
-              <w:right w:w="110" w:type="dxa"/>
-            </w:tcMar>
-            <w:shd w:fill="FFFFFF"/>
-          </w:tcPr>
-          <w:p>
-            <w:pPr>
-              <w:spacing w:after="0"/>
-              <w:jc w:val="center"/>
-            </w:pPr>
-            <w:r>
-              <w:rPr>
-                <w:color w:val="64748B"/>
-                <w:sz w:val="17"/>
-              </w:rPr>
-              <w:t>—</w:t>
-            </w:r>
-          </w:p>
-        </w:tc>
-        <w:tc>
-          <w:tcPr>
-            <w:tcW w:type="dxa" w:w="2880"/>
-            <w:vAlign w:val="center"/>
-            <w:tcMar>
-              <w:top w:w="90" w:type="dxa"/>
-              <w:bottom w:w="90" w:type="dxa"/>
-              <w:left w:w="110" w:type="dxa"/>
-              <w:right w:w="110" w:type="dxa"/>
+              <w:top w:w="80" w:type="dxa"/>
+              <w:bottom w:w="80" w:type="dxa"/>
+              <w:left w:w="100" w:type="dxa"/>
+              <w:right w:w="100" w:type="dxa"/>
             </w:tcMar>
             <w:shd w:fill="F0FDF4"/>
           </w:tcPr>
           <w:p>
             <w:pPr>
               <w:spacing w:after="0"/>
-              <w:jc w:val="center"/>
             </w:pPr>
             <w:r>
               <w:rPr>
-                <w:b/>
-                <w:color w:val="10B981"/>
+                <w:color w:val="1E293B"/>
                 <w:sz w:val="17"/>
               </w:rPr>
-              <w:t>INCLUDED</w:t>
+              <w:t>Full Server Setup, Database Config, SSL &amp; Scheduled Auto-Backups</w:t>
             </w:r>
           </w:p>
         </w:tc>
@@ -1408,13 +1459,39 @@
       <w:tr>
         <w:tc>
           <w:tcPr>
-            <w:tcW w:type="dxa" w:w="4896"/>
+            <w:tcW w:type="dxa" w:w="2880"/>
             <w:vAlign w:val="center"/>
             <w:tcMar>
-              <w:top w:w="90" w:type="dxa"/>
-              <w:bottom w:w="90" w:type="dxa"/>
-              <w:left w:w="110" w:type="dxa"/>
-              <w:right w:w="110" w:type="dxa"/>
+              <w:top w:w="80" w:type="dxa"/>
+              <w:bottom w:w="80" w:type="dxa"/>
+              <w:left w:w="100" w:type="dxa"/>
+              <w:right w:w="100" w:type="dxa"/>
+            </w:tcMar>
+            <w:shd w:fill="F8FAFC"/>
+          </w:tcPr>
+          <w:p>
+            <w:pPr>
+              <w:spacing w:after="0"/>
+            </w:pPr>
+            <w:r>
+              <w:rPr>
+                <w:b/>
+                <w:color w:val="0F2744"/>
+                <w:sz w:val="17"/>
+              </w:rPr>
+              <w:t>Warranty &amp; SLA Support</w:t>
+            </w:r>
+          </w:p>
+        </w:tc>
+        <w:tc>
+          <w:tcPr>
+            <w:tcW w:type="dxa" w:w="3600"/>
+            <w:vAlign w:val="center"/>
+            <w:tcMar>
+              <w:top w:w="80" w:type="dxa"/>
+              <w:bottom w:w="80" w:type="dxa"/>
+              <w:left w:w="100" w:type="dxa"/>
+              <w:right w:w="100" w:type="dxa"/>
             </w:tcMar>
             <w:shd w:fill="F8FAFC"/>
           </w:tcPr>
@@ -1427,76 +1504,21 @@
                 <w:color w:val="1E293B"/>
                 <w:sz w:val="17"/>
               </w:rPr>
-              <w:t>Administrative Accrual Engine (+1.25d/mo &amp; Annual SIL Reset)</w:t>
+              <w:t>60 Days Standard Maintenance Support</w:t>
             </w:r>
           </w:p>
         </w:tc>
         <w:tc>
           <w:tcPr>
-            <w:tcW w:type="dxa" w:w="2592"/>
+            <w:tcW w:type="dxa" w:w="3888"/>
             <w:vAlign w:val="center"/>
             <w:tcMar>
-              <w:top w:w="90" w:type="dxa"/>
-              <w:bottom w:w="90" w:type="dxa"/>
-              <w:left w:w="110" w:type="dxa"/>
-              <w:right w:w="110" w:type="dxa"/>
-            </w:tcMar>
-            <w:shd w:fill="F8FAFC"/>
-          </w:tcPr>
-          <w:p>
-            <w:pPr>
-              <w:spacing w:after="0"/>
-              <w:jc w:val="center"/>
-            </w:pPr>
-            <w:r>
-              <w:rPr>
-                <w:color w:val="64748B"/>
-                <w:sz w:val="17"/>
-              </w:rPr>
-              <w:t>—</w:t>
-            </w:r>
-          </w:p>
-        </w:tc>
-        <w:tc>
-          <w:tcPr>
-            <w:tcW w:type="dxa" w:w="2880"/>
-            <w:vAlign w:val="center"/>
-            <w:tcMar>
-              <w:top w:w="90" w:type="dxa"/>
-              <w:bottom w:w="90" w:type="dxa"/>
-              <w:left w:w="110" w:type="dxa"/>
-              <w:right w:w="110" w:type="dxa"/>
+              <w:top w:w="80" w:type="dxa"/>
+              <w:bottom w:w="80" w:type="dxa"/>
+              <w:left w:w="100" w:type="dxa"/>
+              <w:right w:w="100" w:type="dxa"/>
             </w:tcMar>
             <w:shd w:fill="F0FDF4"/>
-          </w:tcPr>
-          <w:p>
-            <w:pPr>
-              <w:spacing w:after="0"/>
-              <w:jc w:val="center"/>
-            </w:pPr>
-            <w:r>
-              <w:rPr>
-                <w:b/>
-                <w:color w:val="10B981"/>
-                <w:sz w:val="17"/>
-              </w:rPr>
-              <w:t>INCLUDED</w:t>
-            </w:r>
-          </w:p>
-        </w:tc>
-      </w:tr>
-      <w:tr>
-        <w:tc>
-          <w:tcPr>
-            <w:tcW w:type="dxa" w:w="4896"/>
-            <w:vAlign w:val="center"/>
-            <w:tcMar>
-              <w:top w:w="90" w:type="dxa"/>
-              <w:bottom w:w="90" w:type="dxa"/>
-              <w:left w:w="110" w:type="dxa"/>
-              <w:right w:w="110" w:type="dxa"/>
-            </w:tcMar>
-            <w:shd w:fill="FFFFFF"/>
           </w:tcPr>
           <w:p>
             <w:pPr>
@@ -1507,57 +1529,7 @@
                 <w:color w:val="1E293B"/>
                 <w:sz w:val="17"/>
               </w:rPr>
-              <w:t>Warranty &amp; SLA Support Period</w:t>
-            </w:r>
-          </w:p>
-        </w:tc>
-        <w:tc>
-          <w:tcPr>
-            <w:tcW w:type="dxa" w:w="2592"/>
-            <w:vAlign w:val="center"/>
-            <w:tcMar>
-              <w:top w:w="90" w:type="dxa"/>
-              <w:bottom w:w="90" w:type="dxa"/>
-              <w:left w:w="110" w:type="dxa"/>
-              <w:right w:w="110" w:type="dxa"/>
-            </w:tcMar>
-            <w:shd w:fill="FFFFFF"/>
-          </w:tcPr>
-          <w:p>
-            <w:pPr>
-              <w:spacing w:after="0"/>
-              <w:jc w:val="center"/>
-            </w:pPr>
-            <w:r>
-              <w:rPr>
-                <w:sz w:val="17"/>
-              </w:rPr>
-              <w:t>60 Days Standard</w:t>
-            </w:r>
-          </w:p>
-        </w:tc>
-        <w:tc>
-          <w:tcPr>
-            <w:tcW w:type="dxa" w:w="2880"/>
-            <w:vAlign w:val="center"/>
-            <w:tcMar>
-              <w:top w:w="90" w:type="dxa"/>
-              <w:bottom w:w="90" w:type="dxa"/>
-              <w:left w:w="110" w:type="dxa"/>
-              <w:right w:w="110" w:type="dxa"/>
-            </w:tcMar>
-            <w:shd w:fill="FFFFFF"/>
-          </w:tcPr>
-          <w:p>
-            <w:pPr>
-              <w:spacing w:after="0"/>
-              <w:jc w:val="center"/>
-            </w:pPr>
-            <w:r>
-              <w:rPr>
-                <w:sz w:val="17"/>
-              </w:rPr>
-              <w:t>3 Months Priority SLA + Staff Training</w:t>
+              <w:t>3 Months Priority SLA Support + Live Staff Onboarding &amp; Training Session</w:t>
             </w:r>
           </w:p>
         </w:tc>
@@ -1585,7 +1557,7 @@
           <w:color w:val="0F2744"/>
           <w:sz w:val="23"/>
         </w:rPr>
-        <w:t>🥈 Tier 1: Professional CPA Practice Edition — ₱75,000 (The Live Working System)</w:t>
+        <w:t>🥈 Tier 1: Boutique Practice Edition — ₱75,000</w:t>
       </w:r>
     </w:p>
     <w:p>
@@ -1599,14 +1571,14 @@
           <w:color w:val="1E293B"/>
           <w:sz w:val="19"/>
         </w:rPr>
-        <w:t xml:space="preserve">Complete Statutory &amp; Firm Leave Categories: </w:t>
+        <w:t xml:space="preserve">6-User Role-Based Access Control (RBAC): </w:t>
       </w:r>
       <w:r>
         <w:rPr>
           <w:color w:val="1E293B"/>
           <w:sz w:val="19"/>
         </w:rPr>
-        <w:t>Service Incentive Leave (5 days), Vacation Leave, Sick Leave, Solo Parent, Maternity, Paternity, Special Women Leave, VAWC, Bereavement, Emergency, and CPA Board Exam/CPD Study Leave.</w:t>
+        <w:t>Individual login credentials for the Managing Partner and all 5 staff associates.</w:t>
       </w:r>
     </w:p>
     <w:p>
@@ -1620,14 +1592,14 @@
           <w:color w:val="1E293B"/>
           <w:sz w:val="19"/>
         </w:rPr>
-        <w:t xml:space="preserve">Managing Partner Governance: </w:t>
+        <w:t xml:space="preserve">Real-Time Leave Balance Ledger: </w:t>
       </w:r>
       <w:r>
         <w:rPr>
           <w:color w:val="1E293B"/>
           <w:sz w:val="19"/>
         </w:rPr>
-        <w:t>Executive portal with live approval queue, engagement note documentation, and capability to file leaves on behalf of any associate.</w:t>
+        <w:t>Accurate tracking of Vacation Leave (12.0d), Sick Leave (10.0d), Emergency, Bereavement, and LWOP with instant deduction updates.</w:t>
       </w:r>
     </w:p>
     <w:p>
@@ -1641,14 +1613,14 @@
           <w:color w:val="1E293B"/>
           <w:sz w:val="19"/>
         </w:rPr>
-        <w:t xml:space="preserve">Clean Details Modal: </w:t>
+        <w:t xml:space="preserve">Managing Partner Approval Governance: </w:t>
       </w:r>
       <w:r>
         <w:rPr>
           <w:color w:val="1E293B"/>
           <w:sz w:val="19"/>
         </w:rPr>
-        <w:t>Complete breakdown of employee, dates, duration, reason notes, and partner approval status.</w:t>
+        <w:t>Centralized approval queue for Atty. Jonathan Yeo to review, approve, or reject requests with customized feedback/engagement notes.</w:t>
       </w:r>
     </w:p>
     <w:p>
@@ -1662,14 +1634,98 @@
           <w:color w:val="1E293B"/>
           <w:sz w:val="19"/>
         </w:rPr>
-        <w:t xml:space="preserve">Warranty: </w:t>
+        <w:t xml:space="preserve">Partner Proxy Leave Filing: </w:t>
       </w:r>
       <w:r>
         <w:rPr>
           <w:color w:val="1E293B"/>
           <w:sz w:val="19"/>
         </w:rPr>
-        <w:t>60 Days standard bug fix warranty and system maintenance.</w:t>
+        <w:t>Capability for the Managing Partner to file leave on behalf of any associate with instant balance checks.</w:t>
+      </w:r>
+    </w:p>
+    <w:p>
+      <w:pPr>
+        <w:pStyle w:val="ListBullet"/>
+        <w:spacing w:after="60"/>
+      </w:pPr>
+      <w:r>
+        <w:rPr>
+          <w:b/>
+          <w:color w:val="1E293B"/>
+          <w:sz w:val="19"/>
+        </w:rPr>
+        <w:t xml:space="preserve">Staff Self-Service Portal: </w:t>
+      </w:r>
+      <w:r>
+        <w:rPr>
+          <w:color w:val="1E293B"/>
+          <w:sz w:val="19"/>
+        </w:rPr>
+        <w:t>Dedicated dashboard for associates to check remaining credits, submit requests, and track approval status.</w:t>
+      </w:r>
+    </w:p>
+    <w:p>
+      <w:pPr>
+        <w:pStyle w:val="ListBullet"/>
+        <w:spacing w:after="60"/>
+      </w:pPr>
+      <w:r>
+        <w:rPr>
+          <w:b/>
+          <w:color w:val="1E293B"/>
+          <w:sz w:val="19"/>
+        </w:rPr>
+        <w:t xml:space="preserve">Master Firm Leave Ledger: </w:t>
+      </w:r>
+      <w:r>
+        <w:rPr>
+          <w:color w:val="1E293B"/>
+          <w:sz w:val="19"/>
+        </w:rPr>
+        <w:t>Complete historical log of all filings with status filters (Approved, Pending, Rejected).</w:t>
+      </w:r>
+    </w:p>
+    <w:p>
+      <w:pPr>
+        <w:pStyle w:val="ListBullet"/>
+        <w:spacing w:after="60"/>
+      </w:pPr>
+      <w:r>
+        <w:rPr>
+          <w:b/>
+          <w:color w:val="1E293B"/>
+          <w:sz w:val="19"/>
+        </w:rPr>
+        <w:t xml:space="preserve">Server Setup &amp; Deployment: </w:t>
+      </w:r>
+      <w:r>
+        <w:rPr>
+          <w:color w:val="1E293B"/>
+          <w:sz w:val="19"/>
+        </w:rPr>
+        <w:t>Complete deployment, database schema setup, and SSL security configuration on firm infrastructure.</w:t>
+      </w:r>
+    </w:p>
+    <w:p>
+      <w:pPr>
+        <w:pStyle w:val="ListBullet"/>
+        <w:spacing w:after="60"/>
+      </w:pPr>
+      <w:r>
+        <w:rPr>
+          <w:b/>
+          <w:color w:val="1E293B"/>
+          <w:sz w:val="19"/>
+        </w:rPr>
+        <w:t xml:space="preserve">Warranty &amp; Technical Support: </w:t>
+      </w:r>
+      <w:r>
+        <w:rPr>
+          <w:color w:val="1E293B"/>
+          <w:sz w:val="19"/>
+        </w:rPr>
+        <w:t>60 Days standard bug-fix warranty and technical maintenance.</w:t>
       </w:r>
     </w:p>
     <w:p>
@@ -1684,7 +1740,7 @@
           <w:color w:val="0284C7"/>
           <w:sz w:val="23"/>
         </w:rPr>
-        <w:t>🥇 Tier 2: Enterprise Practice Cloud Suite — ₱85,000 ⭐ (Recommended Flagship Package)</w:t>
+        <w:t>🥇 Tier 2: Boutique Practice Cloud Suite — ₱85,000 ⭐ (Recommended Flagship Package)</w:t>
       </w:r>
     </w:p>
     <w:p>
@@ -1699,6 +1755,392 @@
           <w:sz w:val="19"/>
         </w:rPr>
         <w:t>Everything in Tier 1 (₱75,000) PLUS the following high-ticket enterprise modules:</w:t>
+      </w:r>
+    </w:p>
+    <w:p>
+      <w:pPr>
+        <w:pStyle w:val="ListBullet"/>
+        <w:spacing w:after="60"/>
+      </w:pPr>
+      <w:r>
+        <w:rPr>
+          <w:b/>
+          <w:color w:val="0F2744"/>
+          <w:sz w:val="19"/>
+        </w:rPr>
+        <w:t xml:space="preserve">1-Click Formatted Payroll CSV Export Engine: </w:t>
+      </w:r>
+      <w:r>
+        <w:rPr>
+          <w:color w:val="1E293B"/>
+          <w:sz w:val="19"/>
+        </w:rPr>
+        <w:t>Generates payroll deduction summaries custom-formatted for Philippine payroll software (JuanTax, Sprout Solutions, QuickBooks, or Excel). Automatically computes unpaid leave salary deductions per semi-monthly cutoff.</w:t>
+      </w:r>
+    </w:p>
+    <w:p>
+      <w:pPr>
+        <w:pStyle w:val="ListBullet"/>
+        <w:spacing w:after="60"/>
+      </w:pPr>
+      <w:r>
+        <w:rPr>
+          <w:b/>
+          <w:color w:val="0F2744"/>
+          <w:sz w:val="19"/>
+        </w:rPr>
+        <w:t xml:space="preserve">Year-End Unused Leave Cash Conversion Ledger &amp; Reserve Calculator: </w:t>
+      </w:r>
+      <w:r>
+        <w:rPr>
+          <w:color w:val="1E293B"/>
+          <w:sz w:val="19"/>
+        </w:rPr>
+        <w:t>Real-time automated calculator multiplying unconsumed leave balances by each employee's daily rate, providing Atty. Yeo with an instant forecast of annual cash conversion payouts required at year-end.</w:t>
+      </w:r>
+    </w:p>
+    <w:p>
+      <w:pPr>
+        <w:pStyle w:val="ListBullet"/>
+        <w:spacing w:after="60"/>
+      </w:pPr>
+      <w:r>
+        <w:rPr>
+          <w:b/>
+          <w:color w:val="0F2744"/>
+          <w:sz w:val="19"/>
+        </w:rPr>
+        <w:t xml:space="preserve">Interactive 6-Person Team Coverage Calendar: </w:t>
+      </w:r>
+      <w:r>
+        <w:rPr>
+          <w:color w:val="1E293B"/>
+          <w:sz w:val="19"/>
+        </w:rPr>
+        <w:t>Visual monthly schedule showing team availability. Ensures that multiple associates on the same client engagement do not take simultaneous leaves during critical audit deadlines.</w:t>
+      </w:r>
+    </w:p>
+    <w:p>
+      <w:pPr>
+        <w:pStyle w:val="ListBullet"/>
+        <w:spacing w:after="60"/>
+      </w:pPr>
+      <w:r>
+        <w:rPr>
+          <w:b/>
+          <w:color w:val="0F2744"/>
+          <w:sz w:val="19"/>
+        </w:rPr>
+        <w:t xml:space="preserve">Digital Medical Certificate &amp; Supporting Proof Engine: </w:t>
+      </w:r>
+      <w:r>
+        <w:rPr>
+          <w:color w:val="1E293B"/>
+          <w:sz w:val="19"/>
+        </w:rPr>
+        <w:t>Staff can upload physician notes, medical slips, and seminar proof directly in the portal, allowing the Managing Partner to verify legitimacy in 1 click.</w:t>
+      </w:r>
+    </w:p>
+    <w:p>
+      <w:pPr>
+        <w:pStyle w:val="ListBullet"/>
+        <w:spacing w:after="60"/>
+      </w:pPr>
+      <w:r>
+        <w:rPr>
+          <w:b/>
+          <w:color w:val="0F2744"/>
+          <w:sz w:val="19"/>
+        </w:rPr>
+        <w:t xml:space="preserve">Immutable Enterprise Audit Trail with IP Tracking: </w:t>
+      </w:r>
+      <w:r>
+        <w:rPr>
+          <w:color w:val="1E293B"/>
+          <w:sz w:val="19"/>
+        </w:rPr>
+        <w:t>Tamper-proof activity logs capturing every submission, approval, rejection, and balance change with exact timestamps, staff names, and client IP addresses.</w:t>
+      </w:r>
+    </w:p>
+    <w:p>
+      <w:pPr>
+        <w:pStyle w:val="ListBullet"/>
+        <w:spacing w:after="60"/>
+      </w:pPr>
+      <w:r>
+        <w:rPr>
+          <w:b/>
+          <w:color w:val="0F2744"/>
+          <w:sz w:val="19"/>
+        </w:rPr>
+        <w:t xml:space="preserve">Automated Real-Time Email Notifications: </w:t>
+      </w:r>
+      <w:r>
+        <w:rPr>
+          <w:color w:val="1E293B"/>
+          <w:sz w:val="19"/>
+        </w:rPr>
+        <w:t>Instant transactional email alerts sent to associates and Atty. Yeo whenever leaves are submitted, approved, or decided.</w:t>
+      </w:r>
+    </w:p>
+    <w:p>
+      <w:pPr>
+        <w:pStyle w:val="ListBullet"/>
+        <w:spacing w:after="60"/>
+      </w:pPr>
+      <w:r>
+        <w:rPr>
+          <w:b/>
+          <w:color w:val="0F2744"/>
+          <w:sz w:val="19"/>
+        </w:rPr>
+        <w:t xml:space="preserve">Automated Holiday &amp; Working Days Exclusion Calculator: </w:t>
+      </w:r>
+      <w:r>
+        <w:rPr>
+          <w:color w:val="1E293B"/>
+          <w:sz w:val="19"/>
+        </w:rPr>
+        <w:t>Automatically detects and excludes weekends and official statutory regular/special non-working holidays from leave deductions.</w:t>
+      </w:r>
+    </w:p>
+    <w:p>
+      <w:pPr>
+        <w:pStyle w:val="ListBullet"/>
+        <w:spacing w:after="60"/>
+      </w:pPr>
+      <w:r>
+        <w:rPr>
+          <w:b/>
+          <w:color w:val="0F2744"/>
+          <w:sz w:val="19"/>
+        </w:rPr>
+        <w:t xml:space="preserve">Peak Tax Season Blackout Advisory Engine: </w:t>
+      </w:r>
+      <w:r>
+        <w:rPr>
+          <w:color w:val="1E293B"/>
+          <w:sz w:val="19"/>
+        </w:rPr>
+        <w:t>Visual alert banner and clearance reminder for leaves requested during annual income tax return filing cut-offs (March 15 – April 15).</w:t>
+      </w:r>
+    </w:p>
+    <w:p>
+      <w:pPr>
+        <w:pStyle w:val="ListBullet"/>
+        <w:spacing w:after="60"/>
+      </w:pPr>
+      <w:r>
+        <w:rPr>
+          <w:b/>
+          <w:color w:val="0F2744"/>
+          <w:sz w:val="19"/>
+        </w:rPr>
+        <w:t xml:space="preserve">Automated Monthly Accrual &amp; Annual Fiscal Rollover Engine: </w:t>
+      </w:r>
+      <w:r>
+        <w:rPr>
+          <w:color w:val="1E293B"/>
+          <w:sz w:val="19"/>
+        </w:rPr>
+        <w:t>Configurable monthly accrual rules (+1.25d VL monthly) and automated year-end credit resets and rollovers.</w:t>
+      </w:r>
+    </w:p>
+    <w:p>
+      <w:pPr>
+        <w:pStyle w:val="ListBullet"/>
+        <w:spacing w:after="60"/>
+      </w:pPr>
+      <w:r>
+        <w:rPr>
+          <w:b/>
+          <w:color w:val="0F2744"/>
+          <w:sz w:val="19"/>
+        </w:rPr>
+        <w:t xml:space="preserve">Extended Statutory Category Pack: </w:t>
+      </w:r>
+      <w:r>
+        <w:rPr>
+          <w:color w:val="1E293B"/>
+          <w:sz w:val="19"/>
+        </w:rPr>
+        <w:t>Full configuration of Solo Parent Leave, Maternity Leave, Paternity Leave, Special Women Leave, VAWC Leave, and CPA Board Exam/CPD Study Leave.</w:t>
+      </w:r>
+    </w:p>
+    <w:p>
+      <w:pPr>
+        <w:pStyle w:val="ListBullet"/>
+        <w:spacing w:after="60"/>
+      </w:pPr>
+      <w:r>
+        <w:rPr>
+          <w:b/>
+          <w:color w:val="0F2744"/>
+          <w:sz w:val="19"/>
+        </w:rPr>
+        <w:t xml:space="preserve">3 Months Priority SLA Support &amp; Full Staff Onboarding: </w:t>
+      </w:r>
+      <w:r>
+        <w:rPr>
+          <w:color w:val="1E293B"/>
+          <w:sz w:val="19"/>
+        </w:rPr>
+        <w:t>3 Months Extended Priority SLA Support, video walkthroughs, and a live onboarding training session for all 6 firm members.</w:t>
+      </w:r>
+    </w:p>
+    <w:p>
+      <w:pPr>
+        <w:spacing w:after="80"/>
+      </w:pPr>
+    </w:p>
+    <w:p>
+      <w:r>
+        <w:rPr>
+          <w:b/>
+          <w:color w:val="0284C7"/>
+          <w:sz w:val="23"/>
+        </w:rPr>
+        <w:t>🥇 Tier 2: Enterprise Suite — ₱85,000 ⭐ (Recommended Flagship Package)</w:t>
+      </w:r>
+    </w:p>
+    <w:p>
+      <w:pPr>
+        <w:pStyle w:val="ListBullet"/>
+        <w:spacing w:after="60"/>
+      </w:pPr>
+      <w:r>
+        <w:rPr>
+          <w:b/>
+          <w:color w:val="0F2744"/>
+          <w:sz w:val="19"/>
+        </w:rPr>
+        <w:t>Everything in Tier 1 (₱75,000) PLUS the following high-ticket enterprise modules:</w:t>
+      </w:r>
+    </w:p>
+    <w:p>
+      <w:pPr>
+        <w:pStyle w:val="ListBullet"/>
+        <w:spacing w:after="60"/>
+      </w:pPr>
+      <w:r>
+        <w:rPr>
+          <w:b/>
+          <w:color w:val="0F2744"/>
+          <w:sz w:val="19"/>
+        </w:rPr>
+        <w:t xml:space="preserve">Automated Formatted Payroll CSV Export Engine: </w:t>
+      </w:r>
+      <w:r>
+        <w:rPr>
+          <w:color w:val="1E293B"/>
+          <w:sz w:val="19"/>
+        </w:rPr>
+        <w:t>One-click export formatted specifically for Philippine payroll processing (JuanTax, Sprout Solutions, QuickBooks, or custom Excel formats), automatically computing unpaid leave deductions.</w:t>
+      </w:r>
+    </w:p>
+    <w:p>
+      <w:pPr>
+        <w:pStyle w:val="ListBullet"/>
+        <w:spacing w:after="60"/>
+      </w:pPr>
+      <w:r>
+        <w:rPr>
+          <w:b/>
+          <w:color w:val="0F2744"/>
+          <w:sz w:val="19"/>
+        </w:rPr>
+        <w:t xml:space="preserve">Year-End Unused Leave Cash Conversion Ledger: </w:t>
+      </w:r>
+      <w:r>
+        <w:rPr>
+          <w:color w:val="1E293B"/>
+          <w:sz w:val="19"/>
+        </w:rPr>
+        <w:t>Real-time automated computation multiplying unconsumed leave credits by employee daily wage rates, providing Managing Partners with an instant calculation of annual cash liabilities.</w:t>
+      </w:r>
+    </w:p>
+    <w:p>
+      <w:pPr>
+        <w:pStyle w:val="ListBullet"/>
+        <w:spacing w:after="60"/>
+      </w:pPr>
+      <w:r>
+        <w:rPr>
+          <w:b/>
+          <w:color w:val="0F2744"/>
+          <w:sz w:val="19"/>
+        </w:rPr>
+        <w:t xml:space="preserve">Interactive Multi-Department Absence Calendar: </w:t>
+      </w:r>
+      <w:r>
+        <w:rPr>
+          <w:color w:val="1E293B"/>
+          <w:sz w:val="19"/>
+        </w:rPr>
+        <w:t>Visual monthly schedule showing team availability and planned absences to prevent engagement understaffing during client audits.</w:t>
+      </w:r>
+    </w:p>
+    <w:p>
+      <w:pPr>
+        <w:pStyle w:val="ListBullet"/>
+        <w:spacing w:after="60"/>
+      </w:pPr>
+      <w:r>
+        <w:rPr>
+          <w:b/>
+          <w:color w:val="0F2744"/>
+          <w:sz w:val="19"/>
+        </w:rPr>
+        <w:t xml:space="preserve">Medical Certificate &amp; Document Proof Engine: </w:t>
+      </w:r>
+      <w:r>
+        <w:rPr>
+          <w:color w:val="1E293B"/>
+          <w:sz w:val="19"/>
+        </w:rPr>
+        <w:t>Staff can attach physician notes, CPD seminar slips, and death certificates with 1-click in-app viewing.</w:t>
+      </w:r>
+    </w:p>
+    <w:p>
+      <w:pPr>
+        <w:pStyle w:val="ListBullet"/>
+        <w:spacing w:after="60"/>
+      </w:pPr>
+      <w:r>
+        <w:rPr>
+          <w:b/>
+          <w:color w:val="0F2744"/>
+          <w:sz w:val="19"/>
+        </w:rPr>
+        <w:t xml:space="preserve">Immutable Enterprise Audit Trail: </w:t>
+      </w:r>
+      <w:r>
+        <w:rPr>
+          <w:color w:val="1E293B"/>
+          <w:sz w:val="19"/>
+        </w:rPr>
+        <w:t>Tamper-proof audit logs recording every leave submission, approval, rejection, and balance adjustment with exact timestamps, user names, and client IP addresses.</w:t>
+      </w:r>
+    </w:p>
+    <w:p>
+      <w:pPr>
+        <w:pStyle w:val="ListBullet"/>
+        <w:spacing w:after="60"/>
+      </w:pPr>
+      <w:r>
+        <w:rPr>
+          <w:b/>
+          <w:color w:val="0F2744"/>
+          <w:sz w:val="19"/>
+        </w:rPr>
+        <w:t xml:space="preserve">Automated Real-Time Email Notifications: </w:t>
+      </w:r>
+      <w:r>
+        <w:rPr>
+          <w:color w:val="1E293B"/>
+          <w:sz w:val="19"/>
+        </w:rPr>
+        <w:t>Instant transactional email alerts sent to staff and partners whenever leave applications are filed, approved, or rejected.</w:t>
       </w:r>
     </w:p>
     <w:p>
@@ -1754,14 +2196,14 @@
           <w:color w:val="0F2744"/>
           <w:sz w:val="19"/>
         </w:rPr>
-        <w:t xml:space="preserve">Interactive Multi-Department Absence Calendar: </w:t>
+        <w:t xml:space="preserve">Administrative Accrual Engine: </w:t>
       </w:r>
       <w:r>
         <w:rPr>
           <w:color w:val="1E293B"/>
           <w:sz w:val="19"/>
         </w:rPr>
-        <w:t>Visual monthly schedule showing team availability and planned absences to prevent engagement understaffing during client audits.</w:t>
+        <w:t>Automated monthly accrual rules (+1.25d VL monthly) and annual rollover configuration.</w:t>
       </w:r>
     </w:p>
     <w:p>
@@ -1775,119 +2217,14 @@
           <w:color w:val="0F2744"/>
           <w:sz w:val="19"/>
         </w:rPr>
-        <w:t xml:space="preserve">Medical Certificate &amp; Document Proof Engine: </w:t>
+        <w:t xml:space="preserve">Extended Statutory Category Pack: </w:t>
       </w:r>
       <w:r>
         <w:rPr>
           <w:color w:val="1E293B"/>
           <w:sz w:val="19"/>
         </w:rPr>
-        <w:t>Staff can attach physician notes, CPD seminar slips, and death certificates with 1-click in-app viewing.</w:t>
-      </w:r>
-    </w:p>
-    <w:p>
-      <w:pPr>
-        <w:pStyle w:val="ListBullet"/>
-        <w:spacing w:after="60"/>
-      </w:pPr>
-      <w:r>
-        <w:rPr>
-          <w:b/>
-          <w:color w:val="0F2744"/>
-          <w:sz w:val="19"/>
-        </w:rPr>
-        <w:t xml:space="preserve">Year-End Unused Leave Cash Conversion Ledger: </w:t>
-      </w:r>
-      <w:r>
-        <w:rPr>
-          <w:color w:val="1E293B"/>
-          <w:sz w:val="19"/>
-        </w:rPr>
-        <w:t>Real-time automated computation multiplying unconsumed SIL credits by employee daily wage rates, providing Managing Partners with an instant calculation of annual cash liabilities.</w:t>
-      </w:r>
-    </w:p>
-    <w:p>
-      <w:pPr>
-        <w:pStyle w:val="ListBullet"/>
-        <w:spacing w:after="60"/>
-      </w:pPr>
-      <w:r>
-        <w:rPr>
-          <w:b/>
-          <w:color w:val="0F2744"/>
-          <w:sz w:val="19"/>
-        </w:rPr>
-        <w:t xml:space="preserve">Automated Payroll CSV Export Engine: </w:t>
-      </w:r>
-      <w:r>
-        <w:rPr>
-          <w:color w:val="1E293B"/>
-          <w:sz w:val="19"/>
-        </w:rPr>
-        <w:t>One-click export formatted specifically for Philippine payroll processing (JuanTax, Sprout Solutions, QuickBooks, or custom Excel formats), automatically computing unpaid leave deductions.</w:t>
-      </w:r>
-    </w:p>
-    <w:p>
-      <w:pPr>
-        <w:pStyle w:val="ListBullet"/>
-        <w:spacing w:after="60"/>
-      </w:pPr>
-      <w:r>
-        <w:rPr>
-          <w:b/>
-          <w:color w:val="0F2744"/>
-          <w:sz w:val="19"/>
-        </w:rPr>
-        <w:t xml:space="preserve">Immutable Enterprise Audit Trail: </w:t>
-      </w:r>
-      <w:r>
-        <w:rPr>
-          <w:color w:val="1E293B"/>
-          <w:sz w:val="19"/>
-        </w:rPr>
-        <w:t>Tamper-proof audit logs recording every leave submission, approval, rejection, and balance adjustment with exact timestamps, user names, and client IP addresses.</w:t>
-      </w:r>
-    </w:p>
-    <w:p>
-      <w:pPr>
-        <w:pStyle w:val="ListBullet"/>
-        <w:spacing w:after="60"/>
-      </w:pPr>
-      <w:r>
-        <w:rPr>
-          <w:b/>
-          <w:color w:val="0F2744"/>
-          <w:sz w:val="19"/>
-        </w:rPr>
-        <w:t xml:space="preserve">Automated Real-Time Email Notifications: </w:t>
-      </w:r>
-      <w:r>
-        <w:rPr>
-          <w:color w:val="1E293B"/>
-          <w:sz w:val="19"/>
-        </w:rPr>
-        <w:t>Instant transactional email alerts sent to staff and partners whenever leave applications are filed, approved, or rejected.</w:t>
-      </w:r>
-    </w:p>
-    <w:p>
-      <w:pPr>
-        <w:pStyle w:val="ListBullet"/>
-        <w:spacing w:after="60"/>
-      </w:pPr>
-      <w:r>
-        <w:rPr>
-          <w:b/>
-          <w:color w:val="0F2744"/>
-          <w:sz w:val="19"/>
-        </w:rPr>
-        <w:t xml:space="preserve">Administrative Accrual Engine: </w:t>
-      </w:r>
-      <w:r>
-        <w:rPr>
-          <w:color w:val="1E293B"/>
-          <w:sz w:val="19"/>
-        </w:rPr>
-        <w:t>Automated monthly accrual rules (+1.25d VL monthly) and annual 5.0d SIL rollover configuration.</w:t>
+        <w:t>Full configuration of Solo Parent Leave, Maternity Leave, Paternity Leave, Special Women Leave, VAWC Leave, and CPA Board Exam/CPD Study Leave.</w:t>
       </w:r>
     </w:p>
     <w:p>

</xml_diff>